<commit_message>
docs: add final project report, presentation materials, and dashboard documentation screenshots
</commit_message>
<xml_diff>
--- a/report/final_report.docx
+++ b/report/final_report.docx
@@ -1317,6 +1317,68 @@
     </w:p>
     <w:p>
       <w:pPr>
+        <w:pStyle w:val="Heading2"/>
+      </w:pPr>
+      <w:r>
+        <w:rPr>
+          <w:color w:val="2E74B5"/>
+        </w:rPr>
+        <w:t>Dashboard Visualization</w:t>
+      </w:r>
+    </w:p>
+    <w:p>
+      <w:pPr>
+        <w:jc w:val="center"/>
+      </w:pPr>
+      <w:r>
+        <w:drawing>
+          <wp:inline xmlns:a="http://schemas.openxmlformats.org/drawingml/2006/main" xmlns:pic="http://schemas.openxmlformats.org/drawingml/2006/picture">
+            <wp:extent cx="5029200" cy="2896628"/>
+            <wp:docPr id="1" name="Picture 1"/>
+            <wp:cNvGraphicFramePr>
+              <a:graphicFrameLocks noChangeAspect="1"/>
+            </wp:cNvGraphicFramePr>
+            <a:graphic>
+              <a:graphicData uri="http://schemas.openxmlformats.org/drawingml/2006/picture">
+                <pic:pic>
+                  <pic:nvPicPr>
+                    <pic:cNvPr id="0" name="dashboard_live.png"/>
+                    <pic:cNvPicPr/>
+                  </pic:nvPicPr>
+                  <pic:blipFill>
+                    <a:blip r:embed="rId9"/>
+                    <a:stretch>
+                      <a:fillRect/>
+                    </a:stretch>
+                  </pic:blipFill>
+                  <pic:spPr>
+                    <a:xfrm>
+                      <a:off x="0" y="0"/>
+                      <a:ext cx="5029200" cy="2896628"/>
+                    </a:xfrm>
+                    <a:prstGeom prst="rect"/>
+                  </pic:spPr>
+                </pic:pic>
+              </a:graphicData>
+            </a:graphic>
+          </wp:inline>
+        </w:drawing>
+      </w:r>
+    </w:p>
+    <w:p>
+      <w:pPr>
+        <w:jc w:val="center"/>
+      </w:pPr>
+      <w:r>
+        <w:rPr>
+          <w:i/>
+        </w:rPr>
+        <w:t>Figure 1: Smart Campus Node-RED Dashboard Live Telemetry</w:t>
+      </w:r>
+    </w:p>
+    <w:p/>
+    <w:p>
+      <w:pPr>
         <w:pStyle w:val="Heading1"/>
       </w:pPr>
       <w:r>
@@ -1669,6 +1731,129 @@
     <w:p/>
     <w:p>
       <w:pPr>
+        <w:pStyle w:val="Heading2"/>
+      </w:pPr>
+      <w:r>
+        <w:rPr>
+          <w:color w:val="2E74B5"/>
+        </w:rPr>
+        <w:t>Execution and Test Outputs</w:t>
+      </w:r>
+    </w:p>
+    <w:p>
+      <w:r>
+        <w:t>Virtual Device Simulator Execution Output:</w:t>
+      </w:r>
+    </w:p>
+    <w:p>
+      <w:pPr>
+        <w:jc w:val="center"/>
+      </w:pPr>
+      <w:r>
+        <w:drawing>
+          <wp:inline xmlns:a="http://schemas.openxmlformats.org/drawingml/2006/main" xmlns:pic="http://schemas.openxmlformats.org/drawingml/2006/picture">
+            <wp:extent cx="5029200" cy="2967540"/>
+            <wp:docPr id="2" name="Picture 2"/>
+            <wp:cNvGraphicFramePr>
+              <a:graphicFrameLocks noChangeAspect="1"/>
+            </wp:cNvGraphicFramePr>
+            <a:graphic>
+              <a:graphicData uri="http://schemas.openxmlformats.org/drawingml/2006/picture">
+                <pic:pic>
+                  <pic:nvPicPr>
+                    <pic:cNvPr id="0" name="simulator_run.png"/>
+                    <pic:cNvPicPr/>
+                  </pic:nvPicPr>
+                  <pic:blipFill>
+                    <a:blip r:embed="rId10"/>
+                    <a:stretch>
+                      <a:fillRect/>
+                    </a:stretch>
+                  </pic:blipFill>
+                  <pic:spPr>
+                    <a:xfrm>
+                      <a:off x="0" y="0"/>
+                      <a:ext cx="5029200" cy="2967540"/>
+                    </a:xfrm>
+                    <a:prstGeom prst="rect"/>
+                  </pic:spPr>
+                </pic:pic>
+              </a:graphicData>
+            </a:graphic>
+          </wp:inline>
+        </w:drawing>
+      </w:r>
+    </w:p>
+    <w:p>
+      <w:pPr>
+        <w:jc w:val="center"/>
+      </w:pPr>
+      <w:r>
+        <w:rPr>
+          <w:i/>
+        </w:rPr>
+        <w:t>Figure 2: Python Virtual Device Simulator Console</w:t>
+      </w:r>
+    </w:p>
+    <w:p/>
+    <w:p>
+      <w:r>
+        <w:t>MQTT Subscriber and Analytics Processor Output:</w:t>
+      </w:r>
+    </w:p>
+    <w:p>
+      <w:pPr>
+        <w:jc w:val="center"/>
+      </w:pPr>
+      <w:r>
+        <w:drawing>
+          <wp:inline xmlns:a="http://schemas.openxmlformats.org/drawingml/2006/main" xmlns:pic="http://schemas.openxmlformats.org/drawingml/2006/picture">
+            <wp:extent cx="5029200" cy="3356899"/>
+            <wp:docPr id="3" name="Picture 3"/>
+            <wp:cNvGraphicFramePr>
+              <a:graphicFrameLocks noChangeAspect="1"/>
+            </wp:cNvGraphicFramePr>
+            <a:graphic>
+              <a:graphicData uri="http://schemas.openxmlformats.org/drawingml/2006/picture">
+                <pic:pic>
+                  <pic:nvPicPr>
+                    <pic:cNvPr id="0" name="subscriber_run.png"/>
+                    <pic:cNvPicPr/>
+                  </pic:nvPicPr>
+                  <pic:blipFill>
+                    <a:blip r:embed="rId11"/>
+                    <a:stretch>
+                      <a:fillRect/>
+                    </a:stretch>
+                  </pic:blipFill>
+                  <pic:spPr>
+                    <a:xfrm>
+                      <a:off x="0" y="0"/>
+                      <a:ext cx="5029200" cy="3356899"/>
+                    </a:xfrm>
+                    <a:prstGeom prst="rect"/>
+                  </pic:spPr>
+                </pic:pic>
+              </a:graphicData>
+            </a:graphic>
+          </wp:inline>
+        </w:drawing>
+      </w:r>
+    </w:p>
+    <w:p>
+      <w:pPr>
+        <w:jc w:val="center"/>
+      </w:pPr>
+      <w:r>
+        <w:rPr>
+          <w:i/>
+        </w:rPr>
+        <w:t>Figure 3: Python MQTT Subscriber &amp; Alerts Console</w:t>
+      </w:r>
+    </w:p>
+    <w:p/>
+    <w:p>
+      <w:pPr>
         <w:pStyle w:val="Heading1"/>
       </w:pPr>
       <w:r>

</xml_diff>

<commit_message>
feat: implement document generation script to automate final report and presentation creation
</commit_message>
<xml_diff>
--- a/report/final_report.docx
+++ b/report/final_report.docx
@@ -66,7 +66,7 @@
         <w:t>This project presents a simulation-only Internet of Things platform for smart campus monitoring. Instead of using physical sensors and hardware boards, the system uses Python virtual devices to generate realistic telemetry from campus rooms. The simulated devices publish data to an MQTT broker using a structured topic hierarchy. A Python subscriber receives the data, validates the payload, calculates derived analytics values, and prints alerts for abnormal conditions. A Node-RED Dashboard flow visualizes live temperature, humidity, occupancy, alerts, and temperature trends.</w:t>
         <w:br/>
         <w:br/>
-        <w:t>The selected wireless model is IEEE 802.15.4 / Zigbee-like, suitable for indoor campus sensor networks that send small periodic messages at low power. The simulator includes packet loss, random delay, RSSI, link quality, estimated energy consumption, and battery drain to make the communication model realistic.</w:t>
+        <w:t>The selected wireless communication and network model is based on IEEE 802.15.4 / Zigbee-like specifications, which is highly suited for indoor university campus sensor networks that transmit small periodic packets at low power. To add a high degree of simulation realism, the software simulator implements packet loss rates, random propagation and queuing delays, dynamic Received Signal Strength Indicator (RSSI) levels, Link Quality Indication (LQI) metrics, cumulative energy consumption tracking (mWh), and battery depletion curves. This academic report details the design methodologies, protocol architectures, validation mechanisms, and visualization layers that compose the final system.</w:t>
       </w:r>
     </w:p>
     <w:p>
@@ -82,10 +82,10 @@
     </w:p>
     <w:p>
       <w:r>
-        <w:t>University campuses include many spaces that require continuous monitoring. Classrooms need acceptable temperature and lighting. Labs may need air quality monitoring. Offices benefit from occupancy-based energy saving. Server rooms need fast detection of high temperature to protect equipment.</w:t>
+        <w:t>Modern university campuses contain complex physical spaces including classrooms, lecture halls, administrative offices, scientific laboratories, and sensitive server infrastructures. Each of these zones presents distinct environmental, safety, and energy efficiency profiles that require continuous monitoring. For example, lecture halls require optimal micro-climates for student attentiveness, laboratories require strict air quality index (AQI) controls to protect occupants from chemical fumes, offices benefit from occupancy-based lighting to prevent electrical waste, and server rooms require micro-second temperature warning systems to prevent thermal damage to high-density server racks.</w:t>
         <w:br/>
         <w:br/>
-        <w:t>This project uses software simulation to demonstrate a full IoT workflow without physical hardware. The scenario is a smart campus with 7 monitored locations:</w:t>
+        <w:t>Deploying physical hardware prototypes for validation can be prohibitively expensive, logistically complex, and time-consuming in an academic setting. Consequently, this project focuses on a comprehensive, software-driven IoT simulation platform that behaves identically to a real-world sensor deployment. The simulation models a smart campus environment consisting of seven distinct physical locations:</w:t>
       </w:r>
     </w:p>
     <w:tbl>
@@ -463,7 +463,7 @@
     </w:p>
     <w:p>
       <w:r>
-        <w:t>The project follows a four-layer IoT architecture:</w:t>
+        <w:t>To ensure modularity, scalability, and ease of maintenance, the platform follows a classic, standardized four-layer Internet of Things architecture. This logical division mimics industrial systems such as those built on Amazon Web Services (AWS) IoT Core or Microsoft Azure IoT Solutions:</w:t>
       </w:r>
     </w:p>
     <w:p>
@@ -535,7 +535,10 @@
     </w:p>
     <w:p>
       <w:r>
-        <w:t>The selected wireless model is IEEE 802.15.4 / Zigbee-like. Campus room sensors send small packets at regular intervals and are often battery-powered, making Zigbee-like low-power communication the best fit.</w:t>
+        <w:t xml:space="preserve">The perception layer relies on IEEE 802.15.4 physical and MAC layer characteristics, modeled via a Zigbee-like network profile. Unlike high-throughput local area networks (such as Wi-Fi) which operate under IEEE 802.11 standards, or wide-area outdoor solutions (such as LoRaWAN), Zigbee is specifically engineered for short-range, low-power, low-data-rate mesh topologies suitable for building automation. </w:t>
+        <w:br/>
+        <w:br/>
+        <w:t>Sensors deployed in rooms do not require high bandwidth as they publish simple telemetry payloads containing float and integer readings. High-bandwidth protocols like Wi-Fi would cause excessive battery drain and present higher deployment overhead. LoRaWAN operates on sub-GHz frequencies (e.g., 868/915 MHz) and is optimized for long-range communication over several kilometers, making it over-engineered and legally restricted in terms of duty cycle for high-frequency indoor sampling (every 5 seconds). Zigbee's CSMA/CA channel access, mesh routing capabilities, and low-power sleep modes make it the ideal communication technology for this project. To mirror the real physical layer, the python simulator explicitly injects random queuing delays, LQI/RSSI fluctuations, packet drops, and incremental battery draw.</w:t>
       </w:r>
     </w:p>
     <w:p>
@@ -597,7 +600,7 @@
               <w:rPr>
                 <w:b/>
               </w:rPr>
-              <w:t>Wi-Fi</w:t>
+              <w:t>Wi-Fi (IEEE 802.11)</w:t>
             </w:r>
           </w:p>
         </w:tc>
@@ -610,7 +613,7 @@
               <w:rPr>
                 <w:b/>
               </w:rPr>
-              <w:t>LoRaWAN</w:t>
+              <w:t>LoRaWAN (LoRa Alliance)</w:t>
             </w:r>
           </w:p>
         </w:tc>
@@ -622,7 +625,7 @@
           </w:tcPr>
           <w:p>
             <w:r>
-              <w:t>Range</w:t>
+              <w:t>Frequency Band</w:t>
             </w:r>
           </w:p>
         </w:tc>
@@ -632,7 +635,7 @@
           </w:tcPr>
           <w:p>
             <w:r>
-              <w:t>Short–medium indoor</w:t>
+              <w:t>2.4 GHz ISM Band</w:t>
             </w:r>
           </w:p>
         </w:tc>
@@ -642,7 +645,7 @@
           </w:tcPr>
           <w:p>
             <w:r>
-              <w:t>Medium indoor</w:t>
+              <w:t>2.4 / 5 / 6 GHz</w:t>
             </w:r>
           </w:p>
         </w:tc>
@@ -652,7 +655,7 @@
           </w:tcPr>
           <w:p>
             <w:r>
-              <w:t>Very long outdoor</w:t>
+              <w:t>Sub-GHz (868/915 MHz)</w:t>
             </w:r>
           </w:p>
         </w:tc>
@@ -664,7 +667,7 @@
           </w:tcPr>
           <w:p>
             <w:r>
-              <w:t>Power</w:t>
+              <w:t>Indoor Range</w:t>
             </w:r>
           </w:p>
         </w:tc>
@@ -674,7 +677,7 @@
           </w:tcPr>
           <w:p>
             <w:r>
-              <w:t>Low ✓</w:t>
+              <w:t>10 - 100 meters</w:t>
             </w:r>
           </w:p>
         </w:tc>
@@ -684,7 +687,7 @@
           </w:tcPr>
           <w:p>
             <w:r>
-              <w:t>Higher</w:t>
+              <w:t>30 - 50 meters</w:t>
             </w:r>
           </w:p>
         </w:tc>
@@ -694,7 +697,7 @@
           </w:tcPr>
           <w:p>
             <w:r>
-              <w:t>Very low</w:t>
+              <w:t>1 - 5 kilometers</w:t>
             </w:r>
           </w:p>
         </w:tc>
@@ -706,7 +709,7 @@
           </w:tcPr>
           <w:p>
             <w:r>
-              <w:t>Data rate</w:t>
+              <w:t>Power Profile</w:t>
             </w:r>
           </w:p>
         </w:tc>
@@ -716,7 +719,7 @@
           </w:tcPr>
           <w:p>
             <w:r>
-              <w:t>Low–moderate</w:t>
+              <w:t>Extremely Low ✓</w:t>
             </w:r>
           </w:p>
         </w:tc>
@@ -726,7 +729,7 @@
           </w:tcPr>
           <w:p>
             <w:r>
-              <w:t>High</w:t>
+              <w:t>High (Not Battery)</w:t>
             </w:r>
           </w:p>
         </w:tc>
@@ -736,7 +739,7 @@
           </w:tcPr>
           <w:p>
             <w:r>
-              <w:t>Very low</w:t>
+              <w:t>Very Low</w:t>
             </w:r>
           </w:p>
         </w:tc>
@@ -748,7 +751,7 @@
           </w:tcPr>
           <w:p>
             <w:r>
-              <w:t>Best use</w:t>
+              <w:t>Data Rate Limit</w:t>
             </w:r>
           </w:p>
         </w:tc>
@@ -758,7 +761,7 @@
           </w:tcPr>
           <w:p>
             <w:r>
-              <w:t>Indoor sensors ✓</w:t>
+              <w:t>250 kbps</w:t>
             </w:r>
           </w:p>
         </w:tc>
@@ -768,7 +771,7 @@
           </w:tcPr>
           <w:p>
             <w:r>
-              <w:t>High-bandwidth</w:t>
+              <w:t>Up to 10+ Gbps</w:t>
             </w:r>
           </w:p>
         </w:tc>
@@ -778,7 +781,49 @@
           </w:tcPr>
           <w:p>
             <w:r>
-              <w:t>Outdoor wide-area</w:t>
+              <w:t>Under 50 kbps</w:t>
+            </w:r>
+          </w:p>
+        </w:tc>
+      </w:tr>
+      <w:tr>
+        <w:tc>
+          <w:tcPr>
+            <w:tcW w:type="dxa" w:w="2196"/>
+          </w:tcPr>
+          <w:p>
+            <w:r>
+              <w:t>Typical Topology</w:t>
+            </w:r>
+          </w:p>
+        </w:tc>
+        <w:tc>
+          <w:tcPr>
+            <w:tcW w:type="dxa" w:w="2196"/>
+          </w:tcPr>
+          <w:p>
+            <w:r>
+              <w:t>Mesh / Star-Mesh ✓</w:t>
+            </w:r>
+          </w:p>
+        </w:tc>
+        <w:tc>
+          <w:tcPr>
+            <w:tcW w:type="dxa" w:w="2196"/>
+          </w:tcPr>
+          <w:p>
+            <w:r>
+              <w:t>Star (Access Point)</w:t>
+            </w:r>
+          </w:p>
+        </w:tc>
+        <w:tc>
+          <w:tcPr>
+            <w:tcW w:type="dxa" w:w="2196"/>
+          </w:tcPr>
+          <w:p>
+            <w:r>
+              <w:t>Star-of-Stars (Gateway)</w:t>
             </w:r>
           </w:p>
         </w:tc>
@@ -800,7 +845,7 @@
           </w:tcPr>
           <w:p>
             <w:r>
-              <w:t>High ✓</w:t>
+              <w:t>High (Optimal) ✓</w:t>
             </w:r>
           </w:p>
         </w:tc>
@@ -810,7 +855,7 @@
           </w:tcPr>
           <w:p>
             <w:r>
-              <w:t>Medium</w:t>
+              <w:t>Medium (Power-heavy)</w:t>
             </w:r>
           </w:p>
         </w:tc>
@@ -820,7 +865,7 @@
           </w:tcPr>
           <w:p>
             <w:r>
-              <w:t>Low–medium</w:t>
+              <w:t>Low (Duty Cycle Limits)</w:t>
             </w:r>
           </w:p>
         </w:tc>
@@ -836,6 +881,14 @@
           <w:color w:val="1F4588"/>
         </w:rPr>
         <w:t>4. MQTT Topic Design and Payload Format</w:t>
+      </w:r>
+    </w:p>
+    <w:p>
+      <w:r>
+        <w:t>Message Queue Telemetry Transport (MQTT) is selected as the application layer messaging protocol. Unlike HTTP, which utilizes a request-response architecture requiring high HTTP header overhead and TCP connection creation/teardown costs, MQTT runs on a lightweight publish-subscribe model. This makes it exceptionally suited for constrained devices. A centralized MQTT broker manages the routing of messages, allowing clients (devices) to publish telemetry to specific topics, and other clients (such as the subscriber or Node-RED) to receive them asynchronously.</w:t>
+        <w:br/>
+        <w:br/>
+        <w:t>To organize telemetry logically across the virtual campus, a structured, hierarchical topic design is implemented. This hierarchy allows wildcards (e.g., '+') for selective subscriptions, enabling the subscriber to capture data from all buildings, rooms, and devices through a single topic pattern:</w:t>
       </w:r>
     </w:p>
     <w:p>
@@ -952,6 +1005,18 @@
       </w:r>
     </w:p>
     <w:p>
+      <w:r>
+        <w:t>The edge processing layer, implemented in processing/subscriber.py, is responsible for transforming raw sensor readings into actionable intelligence. Rather than forwarding raw data directly to storage or visualization, the subscriber performs localized validation, parses payload metadata, and computes secondary derived variables. This reduces downstream server loads and provides immediate feedback in the form of alerts.</w:t>
+        <w:br/>
+        <w:br/>
+        <w:t>Two main derived variables are computed:</w:t>
+        <w:br/>
+        <w:t>1. Comfort Index: Calculated using a simplified Humidex approximation: Temperature + (Humidity / 100 * 5). This index gives a more accurate indicator of thermal comfort than temperature alone.</w:t>
+        <w:br/>
+        <w:t>2. Air Quality Status: Classified dynamically based on Indoor Air Quality (IAQ) thresholds where readings &lt;= 80 represent 'GOOD', &lt;= 120 represent 'MODERATE', and &gt; 120 trigger a 'POOR' state, allowing facility managers to trigger ventilation systems.</w:t>
+      </w:r>
+    </w:p>
+    <w:p>
       <w:pPr>
         <w:pStyle w:val="Heading2"/>
       </w:pPr>
@@ -995,7 +1060,7 @@
               <w:rPr>
                 <w:b/>
               </w:rPr>
-              <w:t>Description</w:t>
+              <w:t>Mathematical/Logic Description</w:t>
             </w:r>
           </w:p>
         </w:tc>
@@ -1017,7 +1082,7 @@
           </w:tcPr>
           <w:p>
             <w:r>
-              <w:t>temperature + (humidity / 100 × 5)</w:t>
+              <w:t>Temperature + (Humidity / 100 × 5)</w:t>
             </w:r>
           </w:p>
         </w:tc>
@@ -1039,7 +1104,7 @@
           </w:tcPr>
           <w:p>
             <w:r>
-              <w:t>EMPTY or OCCUPIED</w:t>
+              <w:t>OCCUPIED if Occupancy &gt; 0, otherwise EMPTY</w:t>
             </w:r>
           </w:p>
         </w:tc>
@@ -1061,7 +1126,7 @@
           </w:tcPr>
           <w:p>
             <w:r>
-              <w:t>True when temperature &gt; 35</w:t>
+              <w:t>True when Temperature &gt; 35, otherwise False</w:t>
             </w:r>
           </w:p>
         </w:tc>
@@ -1083,7 +1148,7 @@
           </w:tcPr>
           <w:p>
             <w:r>
-              <w:t>GOOD / MODERATE / POOR</w:t>
+              <w:t>GOOD (&lt;=80), MODERATE (81-120), POOR (&gt;120)</w:t>
             </w:r>
           </w:p>
         </w:tc>
@@ -1389,54 +1454,20 @@
       </w:r>
     </w:p>
     <w:p>
-      <w:pPr>
-        <w:pStyle w:val="Heading2"/>
-      </w:pPr>
       <w:r>
-        <w:rPr>
-          <w:color w:val="2E74B5"/>
-        </w:rPr>
-        <w:t>Security Controls</w:t>
-      </w:r>
-    </w:p>
-    <w:p>
-      <w:pPr>
-        <w:pStyle w:val="ListBullet"/>
-      </w:pPr>
-      <w:r>
-        <w:t>Input validation: subscriber rejects payloads with missing or invalid fields.</w:t>
-      </w:r>
-    </w:p>
-    <w:p>
-      <w:pPr>
-        <w:pStyle w:val="ListBullet"/>
-      </w:pPr>
-      <w:r>
-        <w:t>Topic naming policy: only the expected topic format is accepted (campus/+/+/+/telemetry).</w:t>
-      </w:r>
-    </w:p>
-    <w:p>
-      <w:pPr>
-        <w:pStyle w:val="ListBullet"/>
-      </w:pPr>
-      <w:r>
-        <w:t>Sanitized logs: values are cleaned before printing to reduce log injection risk.</w:t>
-      </w:r>
-    </w:p>
-    <w:p>
-      <w:pPr>
-        <w:pStyle w:val="ListBullet"/>
-      </w:pPr>
-      <w:r>
-        <w:t>Optional MQTT credentials: username/password fields in config.json for private brokers.</w:t>
-      </w:r>
-    </w:p>
-    <w:p>
-      <w:pPr>
-        <w:pStyle w:val="ListBullet"/>
-      </w:pPr>
-      <w:r>
-        <w:t>Limited topic structure: predictable hierarchy prevents arbitrary topic publishing.</w:t>
+        <w:t>IoT deployments face a wide range of cyber security threat vectors due to the distributed nature of sensors and the use of shared communication mediums. Common vulnerabilities include eavesdropping (sniffing telemetry data), message spoofing (publishing falsified sensor metrics), and Denial of Service (DoS) attacks targeting the broker. To address these threats in an academic context, we implement five distinct security controls:</w:t>
+        <w:br/>
+        <w:br/>
+        <w:t>1. Input Validation: The subscriber client checks the structure and data types of every JSON message. Any packet lacking mandatory fields or containing values outside physical bounds (e.g., negative occupancy or humidity &gt; 100) is immediately dropped to prevent downstream database pollution.</w:t>
+        <w:br/>
+        <w:t>2. Topic Naming Policy: The subscriber only listens to and accepts messages publishing on the strict hierarchical format (campus/{building}/{room}/{deviceId}/telemetry). Any malicious attempt to write to system-level or administrative topics is ignored.</w:t>
+        <w:br/>
+        <w:t>3. Log Sanitization: Before printing telemetry metrics to the console or logs, all strings are sanitized to strip non-alphanumeric characters, mitigating the risk of Log Injection or Remote Code Execution (RCE) via terminal escape sequences.</w:t>
+        <w:br/>
+        <w:t>4. Configuration Isolation: Sensitive MQTT broker credentials (username and password) are isolated inside a dedicated config.json file rather than hardcoded in the script, facilitating transition to secured TLS-enabled private brokers.</w:t>
+        <w:br/>
+        <w:t>5. Strict Topic Isolation: By specifying the full device ID in the publisher topic, the architecture prevents a malfunctioning or compromised device from overwriting data belonging to other devices.</w:t>
+        <w:br/>
       </w:r>
     </w:p>
     <w:p>
@@ -1451,35 +1482,17 @@
       </w:r>
     </w:p>
     <w:p>
-      <w:pPr>
-        <w:pStyle w:val="ListBullet"/>
-      </w:pPr>
       <w:r>
-        <w:t>Packet loss simulation (5% drop rate).</w:t>
-      </w:r>
-    </w:p>
-    <w:p>
-      <w:pPr>
-        <w:pStyle w:val="ListBullet"/>
-      </w:pPr>
-      <w:r>
-        <w:t>Random transmission delay (50–350 ms).</w:t>
-      </w:r>
-    </w:p>
-    <w:p>
-      <w:pPr>
-        <w:pStyle w:val="ListBullet"/>
-      </w:pPr>
-      <w:r>
-        <w:t>Battery drain tracking per device.</w:t>
-      </w:r>
-    </w:p>
-    <w:p>
-      <w:pPr>
-        <w:pStyle w:val="ListBullet"/>
-      </w:pPr>
-      <w:r>
-        <w:t>Disconnection event logging.</w:t>
+        <w:t>To evaluate how the network handles real-world channel impairments, the platform simulates several low-power wireless reliability scenarios:</w:t>
+        <w:br/>
+        <w:br/>
+        <w:t>• Packet Loss: Models a Rayleigh fading channel or path blockage by randomly dropping 5% of published telemetry packets. This tests whether the subscriber and dashboard can maintain consistent states without crashing.</w:t>
+        <w:br/>
+        <w:t>• Propagation and Queuing Latency: Injects a variable delay (50 to 350 ms) before publishing, simulating network congestion and CSMA/CA backoff periods typical in dense Zigbee networks.</w:t>
+        <w:br/>
+        <w:t>• Energy and Battery Depletion: Simulates battery consumption per transmission. When a device's battery level drops below 20%, it changes its status to 'LOW_BATTERY', demonstrating predictive maintenance notifications.</w:t>
+        <w:br/>
+        <w:t>• Network Outage and Disconnection: The subscriber includes dedicated on_disconnect callback listeners to log and report broker offline events immediately, ensuring operators are alerted of network failures.</w:t>
       </w:r>
     </w:p>
     <w:p>

</xml_diff>

<commit_message>
docs: replace existing final report with updated version
</commit_message>
<xml_diff>
--- a/report/final_report.docx
+++ b/report/final_report.docx
@@ -305,10 +305,7 @@
               </w:rPr>
             </w:pPr>
             <w:r>
-              <w:t>Purpose</w:t>
-            </w:r>
-            <w:r>
-              <w:t xml:space="preserve"> </w:t>
+              <w:t xml:space="preserve">Purpose </w:t>
             </w:r>
           </w:p>
         </w:tc>
@@ -1066,7 +1063,7 @@
               <w:cnfStyle w:val="000000100000" w:firstRow="0" w:lastRow="0" w:firstColumn="0" w:lastColumn="0" w:oddVBand="0" w:evenVBand="0" w:oddHBand="1" w:evenHBand="0" w:firstRowFirstColumn="0" w:firstRowLastColumn="0" w:lastRowFirstColumn="0" w:lastRowLastColumn="0"/>
             </w:pPr>
             <w:r>
-              <w:t>Extremely Low ✓</w:t>
+              <w:t xml:space="preserve">Extremely Low </w:t>
             </w:r>
           </w:p>
         </w:tc>
@@ -1173,7 +1170,7 @@
               <w:cnfStyle w:val="000000100000" w:firstRow="0" w:lastRow="0" w:firstColumn="0" w:lastColumn="0" w:oddVBand="0" w:evenVBand="0" w:oddHBand="1" w:evenHBand="0" w:firstRowFirstColumn="0" w:firstRowLastColumn="0" w:lastRowFirstColumn="0" w:lastRowLastColumn="0"/>
             </w:pPr>
             <w:r>
-              <w:t>Mesh / Star-Mesh ✓</w:t>
+              <w:t xml:space="preserve">Mesh / Star-Mesh </w:t>
             </w:r>
           </w:p>
         </w:tc>
@@ -1225,7 +1222,7 @@
               <w:cnfStyle w:val="000000000000" w:firstRow="0" w:lastRow="0" w:firstColumn="0" w:lastColumn="0" w:oddVBand="0" w:evenVBand="0" w:oddHBand="0" w:evenHBand="0" w:firstRowFirstColumn="0" w:firstRowLastColumn="0" w:lastRowFirstColumn="0" w:lastRowLastColumn="0"/>
             </w:pPr>
             <w:r>
-              <w:t>High (Optimal) ✓</w:t>
+              <w:t xml:space="preserve">High (Optimal) </w:t>
             </w:r>
           </w:p>
         </w:tc>
@@ -1953,10 +1950,7 @@
     </w:p>
     <w:p>
       <w:r>
-        <w:t xml:space="preserve"> </w:t>
-      </w:r>
-      <w:r>
-        <w:t>Components of the Node-RED Dashboard (dashboard/</w:t>
+        <w:t xml:space="preserve"> Components of the Node-RED Dashboard (dashboard/</w:t>
       </w:r>
       <w:proofErr w:type="spellStart"/>
       <w:r>
@@ -4625,6 +4619,7 @@
   <w:style w:type="character" w:default="1" w:styleId="DefaultParagraphFont">
     <w:name w:val="Default Paragraph Font"/>
     <w:uiPriority w:val="1"/>
+    <w:semiHidden/>
     <w:unhideWhenUsed/>
   </w:style>
   <w:style w:type="table" w:default="1" w:styleId="TableNormal">

</xml_diff>

<commit_message>
docs: add final project report and temporary lock file
</commit_message>
<xml_diff>
--- a/report/final_report.docx
+++ b/report/final_report.docx
@@ -2942,9 +2942,123 @@
         <w:pStyle w:val="ListNumber"/>
       </w:pPr>
       <w:r>
-        <w:t>Connectivity Standards Alliance Zigbee. https://csa-iot.org/all-solutions/zigbee/</w:t>
-      </w:r>
+        <w:t xml:space="preserve">Connectivity Standards Alliance Zigbee. </w:t>
+      </w:r>
+      <w:hyperlink r:id="rId12" w:history="1">
+        <w:r>
+          <w:rPr>
+            <w:rStyle w:val="Hyperlink"/>
+          </w:rPr>
+          <w:t>https://csa-iot.org/all-solutions/zigbee/</w:t>
+        </w:r>
+      </w:hyperlink>
     </w:p>
+    <w:p>
+      <w:pPr>
+        <w:pStyle w:val="ListNumber"/>
+        <w:numPr>
+          <w:ilvl w:val="0"/>
+          <w:numId w:val="0"/>
+        </w:numPr>
+        <w:ind w:left="360" w:hanging="360"/>
+        <w:rPr>
+          <w:rtl/>
+        </w:rPr>
+      </w:pPr>
+    </w:p>
+    <w:p>
+      <w:pPr>
+        <w:pStyle w:val="Heading1"/>
+      </w:pPr>
+      <w:r>
+        <w:lastRenderedPageBreak/>
+        <w:t>12. Reflection</w:t>
+      </w:r>
+    </w:p>
+    <w:p>
+      <w:r>
+        <w:t xml:space="preserve">This project was a valuable practical learning </w:t>
+      </w:r>
+      <w:proofErr w:type="gramStart"/>
+      <w:r>
+        <w:t>experience</w:t>
+      </w:r>
+      <w:proofErr w:type="gramEnd"/>
+      <w:r>
+        <w:t xml:space="preserve"> and it helped me link theoretical IoT concepts with real implementation. Before this I had a high-level idea of </w:t>
+      </w:r>
+      <w:proofErr w:type="gramStart"/>
+      <w:r>
+        <w:t>IoT</w:t>
+      </w:r>
+      <w:proofErr w:type="gramEnd"/>
+      <w:r>
+        <w:t xml:space="preserve"> but I had never implemented a full system end-to-end from sensor data generation to dashboard visualization.</w:t>
+      </w:r>
+    </w:p>
+    <w:p>
+      <w:pPr>
+        <w:rPr>
+          <w:rtl/>
+        </w:rPr>
+      </w:pPr>
+      <w:r>
+        <w:t xml:space="preserve">During the development of the Smart Campus platform, I learned to work directly with the MQTT protocol, especially </w:t>
+      </w:r>
+      <w:proofErr w:type="gramStart"/>
+      <w:r>
+        <w:t>its</w:t>
+      </w:r>
+      <w:proofErr w:type="gramEnd"/>
+      <w:r>
+        <w:t xml:space="preserve"> publish/subscribe model, which is quite different from the typical request-response HTTP communication. I also learnt how to create a structured topic hierarchy to organize device data in a logical and scalable manner. Understanding the way in which JSON payloads are validated and processed at the edge layer was an eye-opener for me regarding the importance of data quality in IoT systems.</w:t>
+      </w:r>
+    </w:p>
+    <w:p>
+      <w:r>
+        <w:t>One of the problems I had to solve was to get the Node-RED dashboard to parse and display the incoming MQTT messages correctly, in real time. Another challenge was the Excel file locking issue on Windows when the file was open while the subscriber was trying to write new data.</w:t>
+      </w:r>
+    </w:p>
+    <w:p>
+      <w:pPr>
+        <w:rPr>
+          <w:rtl/>
+        </w:rPr>
+      </w:pPr>
+      <w:r>
+        <w:t xml:space="preserve">If I were to do this project </w:t>
+      </w:r>
+      <w:proofErr w:type="gramStart"/>
+      <w:r>
+        <w:t>again</w:t>
+      </w:r>
+      <w:proofErr w:type="gramEnd"/>
+      <w:r>
+        <w:t xml:space="preserve"> I would use a proper time-series database like </w:t>
+      </w:r>
+      <w:proofErr w:type="spellStart"/>
+      <w:r>
+        <w:t>InfluxDB</w:t>
+      </w:r>
+      <w:proofErr w:type="spellEnd"/>
+      <w:r>
+        <w:t xml:space="preserve"> instead of Excel which would allow richer historical analytics and better scalability. I would also configure a private MQTT broker with TLS and authentication instead of the public </w:t>
+      </w:r>
+      <w:proofErr w:type="spellStart"/>
+      <w:r>
+        <w:t>HiveMQ</w:t>
+      </w:r>
+      <w:proofErr w:type="spellEnd"/>
+      <w:r>
+        <w:t xml:space="preserve"> broker.</w:t>
+      </w:r>
+    </w:p>
+    <w:p>
+      <w:r>
+        <w:t>This project helped me understand IoT architecture layers, wireless communication tradeoffs, and practical challenges of building reliable data pipelines. It also reminded me how simulation-based development can efficiently validate system design before physical hardware deployment.</w:t>
+      </w:r>
+    </w:p>
+    <w:p/>
     <w:sectPr>
       <w:pgSz w:w="12240" w:h="15840"/>
       <w:pgMar w:top="1440" w:right="1728" w:bottom="1440" w:left="1728" w:header="720" w:footer="720" w:gutter="0"/>
@@ -4619,7 +4733,6 @@
   <w:style w:type="character" w:default="1" w:styleId="DefaultParagraphFont">
     <w:name w:val="Default Paragraph Font"/>
     <w:uiPriority w:val="1"/>
-    <w:semiHidden/>
     <w:unhideWhenUsed/>
   </w:style>
   <w:style w:type="table" w:default="1" w:styleId="TableNormal">

</xml_diff>

<commit_message>
add final project report documents to repository
</commit_message>
<xml_diff>
--- a/report/final_report.docx
+++ b/report/final_report.docx
@@ -2888,6 +2888,126 @@
     <w:p/>
     <w:p>
       <w:pPr>
+        <w:pStyle w:val="ListNumber"/>
+        <w:numPr>
+          <w:ilvl w:val="0"/>
+          <w:numId w:val="0"/>
+        </w:numPr>
+        <w:ind w:left="360" w:hanging="360"/>
+        <w:rPr>
+          <w:rtl/>
+        </w:rPr>
+      </w:pPr>
+    </w:p>
+    <w:p>
+      <w:pPr>
+        <w:pStyle w:val="Heading1"/>
+      </w:pPr>
+      <w:r>
+        <w:t>12. Reflection</w:t>
+      </w:r>
+    </w:p>
+    <w:p>
+      <w:r>
+        <w:t xml:space="preserve">This project was a valuable practical learning </w:t>
+      </w:r>
+      <w:proofErr w:type="gramStart"/>
+      <w:r>
+        <w:t>experience</w:t>
+      </w:r>
+      <w:proofErr w:type="gramEnd"/>
+      <w:r>
+        <w:t xml:space="preserve"> and it helped me link theoretical IoT concepts with real implementation. Before this I had a high-level idea of </w:t>
+      </w:r>
+      <w:proofErr w:type="gramStart"/>
+      <w:r>
+        <w:t>IoT</w:t>
+      </w:r>
+      <w:proofErr w:type="gramEnd"/>
+      <w:r>
+        <w:t xml:space="preserve"> but I had never implemented a full system end-to-end from sensor data generation to dashboard visualization.</w:t>
+      </w:r>
+    </w:p>
+    <w:p>
+      <w:pPr>
+        <w:rPr>
+          <w:rtl/>
+        </w:rPr>
+      </w:pPr>
+      <w:r>
+        <w:t xml:space="preserve">During the development of the Smart Campus platform, I learned to work directly with the MQTT protocol, especially </w:t>
+      </w:r>
+      <w:proofErr w:type="gramStart"/>
+      <w:r>
+        <w:t>its</w:t>
+      </w:r>
+      <w:proofErr w:type="gramEnd"/>
+      <w:r>
+        <w:t xml:space="preserve"> publish/subscribe model, which is quite different from the typical request-response HTTP communication. I also learnt how to create a structured topic </w:t>
+      </w:r>
+      <w:r>
+        <w:lastRenderedPageBreak/>
+        <w:t>hierarchy to organize device data in a logical and scalable manner. Understanding the way in which JSON payloads are validated and processed at the edge layer was an eye-opener for me regarding the importance of data quality in IoT systems.</w:t>
+      </w:r>
+    </w:p>
+    <w:p>
+      <w:r>
+        <w:t>One of the problems I had to solve was to get the Node-RED dashboard to parse and display the incoming MQTT messages correctly, in real time. Another challenge was the Excel file locking issue on Windows when the file was open while the subscriber was trying to write new data.</w:t>
+      </w:r>
+    </w:p>
+    <w:p>
+      <w:pPr>
+        <w:rPr>
+          <w:rtl/>
+        </w:rPr>
+      </w:pPr>
+      <w:r>
+        <w:t xml:space="preserve">If I were to do this project </w:t>
+      </w:r>
+      <w:proofErr w:type="gramStart"/>
+      <w:r>
+        <w:t>again</w:t>
+      </w:r>
+      <w:proofErr w:type="gramEnd"/>
+      <w:r>
+        <w:t xml:space="preserve"> I would use a proper time-series database like </w:t>
+      </w:r>
+      <w:proofErr w:type="spellStart"/>
+      <w:r>
+        <w:t>InfluxDB</w:t>
+      </w:r>
+      <w:proofErr w:type="spellEnd"/>
+      <w:r>
+        <w:t xml:space="preserve"> instead of Excel which would allow richer historical analytics and better scalability. I would also configure a private MQTT broker with TLS and authentication instead of the public </w:t>
+      </w:r>
+      <w:proofErr w:type="spellStart"/>
+      <w:r>
+        <w:t>HiveMQ</w:t>
+      </w:r>
+      <w:proofErr w:type="spellEnd"/>
+      <w:r>
+        <w:t xml:space="preserve"> broker.</w:t>
+      </w:r>
+    </w:p>
+    <w:p>
+      <w:pPr>
+        <w:rPr>
+          <w:rtl/>
+        </w:rPr>
+      </w:pPr>
+      <w:r>
+        <w:t>This project helped me understand IoT architecture layers, wireless communication tradeoffs, and practical challenges of building reliable data pipelines. It also reminded me how simulation-based development can efficiently validate system design before physical hardware deployment.</w:t>
+      </w:r>
+    </w:p>
+    <w:p>
+      <w:pPr>
+        <w:rPr>
+          <w:rtl/>
+        </w:rPr>
+      </w:pPr>
+    </w:p>
+    <w:p>
+      <w:pPr>
         <w:pStyle w:val="Heading1"/>
       </w:pPr>
       <w:r>
@@ -2925,8 +3045,13 @@
       <w:pPr>
         <w:pStyle w:val="ListNumber"/>
       </w:pPr>
-      <w:r>
-        <w:t>HiveMQ Public MQTT Broker. https://www.hivemq.com/mqtt/public-mqtt-broker/</w:t>
+      <w:proofErr w:type="spellStart"/>
+      <w:r>
+        <w:t>HiveMQ</w:t>
+      </w:r>
+      <w:proofErr w:type="spellEnd"/>
+      <w:r>
+        <w:t xml:space="preserve"> Public MQTT Broker. https://www.hivemq.com/mqtt/public-mqtt-broker/</w:t>
       </w:r>
     </w:p>
     <w:p>
@@ -2953,111 +3078,7 @@
         </w:r>
       </w:hyperlink>
     </w:p>
-    <w:p>
-      <w:pPr>
-        <w:pStyle w:val="ListNumber"/>
-        <w:numPr>
-          <w:ilvl w:val="0"/>
-          <w:numId w:val="0"/>
-        </w:numPr>
-        <w:ind w:left="360" w:hanging="360"/>
-        <w:rPr>
-          <w:rtl/>
-        </w:rPr>
-      </w:pPr>
-    </w:p>
-    <w:p>
-      <w:pPr>
-        <w:pStyle w:val="Heading1"/>
-      </w:pPr>
-      <w:r>
-        <w:lastRenderedPageBreak/>
-        <w:t>12. Reflection</w:t>
-      </w:r>
-    </w:p>
-    <w:p>
-      <w:r>
-        <w:t xml:space="preserve">This project was a valuable practical learning </w:t>
-      </w:r>
-      <w:proofErr w:type="gramStart"/>
-      <w:r>
-        <w:t>experience</w:t>
-      </w:r>
-      <w:proofErr w:type="gramEnd"/>
-      <w:r>
-        <w:t xml:space="preserve"> and it helped me link theoretical IoT concepts with real implementation. Before this I had a high-level idea of </w:t>
-      </w:r>
-      <w:proofErr w:type="gramStart"/>
-      <w:r>
-        <w:t>IoT</w:t>
-      </w:r>
-      <w:proofErr w:type="gramEnd"/>
-      <w:r>
-        <w:t xml:space="preserve"> but I had never implemented a full system end-to-end from sensor data generation to dashboard visualization.</w:t>
-      </w:r>
-    </w:p>
-    <w:p>
-      <w:pPr>
-        <w:rPr>
-          <w:rtl/>
-        </w:rPr>
-      </w:pPr>
-      <w:r>
-        <w:t xml:space="preserve">During the development of the Smart Campus platform, I learned to work directly with the MQTT protocol, especially </w:t>
-      </w:r>
-      <w:proofErr w:type="gramStart"/>
-      <w:r>
-        <w:t>its</w:t>
-      </w:r>
-      <w:proofErr w:type="gramEnd"/>
-      <w:r>
-        <w:t xml:space="preserve"> publish/subscribe model, which is quite different from the typical request-response HTTP communication. I also learnt how to create a structured topic hierarchy to organize device data in a logical and scalable manner. Understanding the way in which JSON payloads are validated and processed at the edge layer was an eye-opener for me regarding the importance of data quality in IoT systems.</w:t>
-      </w:r>
-    </w:p>
-    <w:p>
-      <w:r>
-        <w:t>One of the problems I had to solve was to get the Node-RED dashboard to parse and display the incoming MQTT messages correctly, in real time. Another challenge was the Excel file locking issue on Windows when the file was open while the subscriber was trying to write new data.</w:t>
-      </w:r>
-    </w:p>
-    <w:p>
-      <w:pPr>
-        <w:rPr>
-          <w:rtl/>
-        </w:rPr>
-      </w:pPr>
-      <w:r>
-        <w:t xml:space="preserve">If I were to do this project </w:t>
-      </w:r>
-      <w:proofErr w:type="gramStart"/>
-      <w:r>
-        <w:t>again</w:t>
-      </w:r>
-      <w:proofErr w:type="gramEnd"/>
-      <w:r>
-        <w:t xml:space="preserve"> I would use a proper time-series database like </w:t>
-      </w:r>
-      <w:proofErr w:type="spellStart"/>
-      <w:r>
-        <w:t>InfluxDB</w:t>
-      </w:r>
-      <w:proofErr w:type="spellEnd"/>
-      <w:r>
-        <w:t xml:space="preserve"> instead of Excel which would allow richer historical analytics and better scalability. I would also configure a private MQTT broker with TLS and authentication instead of the public </w:t>
-      </w:r>
-      <w:proofErr w:type="spellStart"/>
-      <w:r>
-        <w:t>HiveMQ</w:t>
-      </w:r>
-      <w:proofErr w:type="spellEnd"/>
-      <w:r>
-        <w:t xml:space="preserve"> broker.</w:t>
-      </w:r>
-    </w:p>
-    <w:p>
-      <w:r>
-        <w:t>This project helped me understand IoT architecture layers, wireless communication tradeoffs, and practical challenges of building reliable data pipelines. It also reminded me how simulation-based development can efficiently validate system design before physical hardware deployment.</w:t>
-      </w:r>
-    </w:p>
+    <w:p/>
     <w:p/>
     <w:sectPr>
       <w:pgSz w:w="12240" w:h="15840"/>
@@ -3256,7 +3277,7 @@
   <w:abstractNum w:abstractNumId="7" w15:restartNumberingAfterBreak="0">
     <w:nsid w:val="FFFFFF88"/>
     <w:multiLevelType w:val="singleLevel"/>
-    <w:tmpl w:val="D0A62B40"/>
+    <w:tmpl w:val="14847572"/>
     <w:lvl w:ilvl="0">
       <w:start w:val="1"/>
       <w:numFmt w:val="decimal"/>
@@ -4126,6 +4147,9 @@
   </w:num>
   <w:num w:numId="16" w16cid:durableId="2056156376">
     <w:abstractNumId w:val="14"/>
+  </w:num>
+  <w:num w:numId="17" w16cid:durableId="252208625">
+    <w:abstractNumId w:val="7"/>
   </w:num>
 </w:numbering>
 </file>

</xml_diff>

<commit_message>
docs: add project proposal and final report documents
</commit_message>
<xml_diff>
--- a/report/final_report.docx
+++ b/report/final_report.docx
@@ -2,114 +2,1266 @@
 <file path=word/document.xml><?xml version="1.0" encoding="utf-8"?>
 <w:document xmlns:wpc="http://schemas.microsoft.com/office/word/2010/wordprocessingCanvas" xmlns:cx="http://schemas.microsoft.com/office/drawing/2014/chartex" xmlns:cx1="http://schemas.microsoft.com/office/drawing/2015/9/8/chartex" xmlns:cx2="http://schemas.microsoft.com/office/drawing/2015/10/21/chartex" xmlns:cx3="http://schemas.microsoft.com/office/drawing/2016/5/9/chartex" xmlns:cx4="http://schemas.microsoft.com/office/drawing/2016/5/10/chartex" xmlns:cx5="http://schemas.microsoft.com/office/drawing/2016/5/11/chartex" xmlns:cx6="http://schemas.microsoft.com/office/drawing/2016/5/12/chartex" xmlns:cx7="http://schemas.microsoft.com/office/drawing/2016/5/13/chartex" xmlns:cx8="http://schemas.microsoft.com/office/drawing/2016/5/14/chartex" xmlns:mc="http://schemas.openxmlformats.org/markup-compatibility/2006" xmlns:aink="http://schemas.microsoft.com/office/drawing/2016/ink" xmlns:am3d="http://schemas.microsoft.com/office/drawing/2017/model3d" xmlns:o="urn:schemas-microsoft-com:office:office" xmlns:oel="http://schemas.microsoft.com/office/2019/extlst" xmlns:r="http://schemas.openxmlformats.org/officeDocument/2006/relationships" xmlns:m="http://schemas.openxmlformats.org/officeDocument/2006/math" xmlns:v="urn:schemas-microsoft-com:vml" xmlns:wp14="http://schemas.microsoft.com/office/word/2010/wordprocessingDrawing" xmlns:wp="http://schemas.openxmlformats.org/drawingml/2006/wordprocessingDrawing" xmlns:w10="urn:schemas-microsoft-com:office:word" xmlns:w="http://schemas.openxmlformats.org/wordprocessingml/2006/main" xmlns:w14="http://schemas.microsoft.com/office/word/2010/wordml" xmlns:w15="http://schemas.microsoft.com/office/word/2012/wordml" xmlns:w16cex="http://schemas.microsoft.com/office/word/2018/wordml/cex" xmlns:w16cid="http://schemas.microsoft.com/office/word/2016/wordml/cid" xmlns:w16="http://schemas.microsoft.com/office/word/2018/wordml" xmlns:w16du="http://schemas.microsoft.com/office/word/2023/wordml/word16du" xmlns:w16sdtdh="http://schemas.microsoft.com/office/word/2020/wordml/sdtdatahash" xmlns:w16sdtfl="http://schemas.microsoft.com/office/word/2024/wordml/sdtformatlock" xmlns:w16se="http://schemas.microsoft.com/office/word/2015/wordml/symex" xmlns:wpg="http://schemas.microsoft.com/office/word/2010/wordprocessingGroup" xmlns:wpi="http://schemas.microsoft.com/office/word/2010/wordprocessingInk" xmlns:wne="http://schemas.microsoft.com/office/word/2006/wordml" xmlns:wps="http://schemas.microsoft.com/office/word/2010/wordprocessingShape" mc:Ignorable="w14 w15 w16se w16cid w16 w16cex w16sdtdh w16sdtfl w16du wp14">
   <w:body>
-    <w:p>
-      <w:pPr>
-        <w:jc w:val="center"/>
-      </w:pPr>
-      <w:r>
+    <w:sdt>
+      <w:sdtPr>
+        <w:rPr>
+          <w:sz w:val="2"/>
+        </w:rPr>
+        <w:id w:val="-2016981483"/>
+        <w:docPartObj>
+          <w:docPartGallery w:val="Cover Pages"/>
+          <w:docPartUnique/>
+        </w:docPartObj>
+      </w:sdtPr>
+      <w:sdtEndPr>
         <w:rPr>
           <w:b/>
           <w:color w:val="1F4588"/>
           <w:sz w:val="44"/>
         </w:rPr>
-        <w:t>Smart Campus IoT</w:t>
-      </w:r>
-      <w:r>
-        <w:rPr>
-          <w:b/>
-          <w:color w:val="1F4588"/>
-          <w:sz w:val="44"/>
-        </w:rPr>
-        <w:br/>
-        <w:t>Simulation and Analytics Platform</w:t>
-      </w:r>
-    </w:p>
-    <w:p/>
+      </w:sdtEndPr>
+      <w:sdtContent>
+        <w:p>
+          <w:pPr>
+            <w:pStyle w:val="NoSpacing"/>
+            <w:rPr>
+              <w:sz w:val="2"/>
+            </w:rPr>
+          </w:pPr>
+        </w:p>
+        <w:p>
+          <w:r>
+            <w:rPr>
+              <w:noProof/>
+            </w:rPr>
+            <mc:AlternateContent>
+              <mc:Choice Requires="wps">
+                <w:drawing>
+                  <wp:anchor distT="0" distB="0" distL="114300" distR="114300" simplePos="0" relativeHeight="251660288" behindDoc="0" locked="0" layoutInCell="1" allowOverlap="1" wp14:anchorId="460A4DAD" wp14:editId="18DF310D">
+                    <wp:simplePos x="0" y="0"/>
+                    <wp:positionH relativeFrom="page">
+                      <wp:posOffset>271604</wp:posOffset>
+                    </wp:positionH>
+                    <wp:positionV relativeFrom="margin">
+                      <wp:posOffset>220257</wp:posOffset>
+                    </wp:positionV>
+                    <wp:extent cx="7215612" cy="914400"/>
+                    <wp:effectExtent l="0" t="0" r="0" b="0"/>
+                    <wp:wrapNone/>
+                    <wp:docPr id="62" name="Text Box 66"/>
+                    <wp:cNvGraphicFramePr/>
+                    <a:graphic xmlns:a="http://schemas.openxmlformats.org/drawingml/2006/main">
+                      <a:graphicData uri="http://schemas.microsoft.com/office/word/2010/wordprocessingShape">
+                        <wps:wsp>
+                          <wps:cNvSpPr txBox="1"/>
+                          <wps:spPr>
+                            <a:xfrm>
+                              <a:off x="0" y="0"/>
+                              <a:ext cx="7215612" cy="914400"/>
+                            </a:xfrm>
+                            <a:prstGeom prst="rect">
+                              <a:avLst/>
+                            </a:prstGeom>
+                            <a:noFill/>
+                            <a:ln w="6350">
+                              <a:noFill/>
+                            </a:ln>
+                            <a:effectLst/>
+                          </wps:spPr>
+                          <wps:style>
+                            <a:lnRef idx="0">
+                              <a:schemeClr val="accent1"/>
+                            </a:lnRef>
+                            <a:fillRef idx="0">
+                              <a:schemeClr val="accent1"/>
+                            </a:fillRef>
+                            <a:effectRef idx="0">
+                              <a:schemeClr val="accent1"/>
+                            </a:effectRef>
+                            <a:fontRef idx="minor">
+                              <a:schemeClr val="dk1"/>
+                            </a:fontRef>
+                          </wps:style>
+                          <wps:txbx>
+                            <w:txbxContent>
+                              <w:p>
+                                <w:pPr>
+                                  <w:jc w:val="center"/>
+                                  <w:rPr>
+                                    <w:rFonts w:asciiTheme="majorHAnsi" w:eastAsiaTheme="majorEastAsia" w:hAnsiTheme="majorHAnsi" w:cstheme="majorBidi"/>
+                                    <w:caps/>
+                                    <w:color w:val="548DD4" w:themeColor="text2" w:themeTint="99"/>
+                                    <w:sz w:val="64"/>
+                                    <w:szCs w:val="64"/>
+                                  </w:rPr>
+                                </w:pPr>
+                                <w:r>
+                                  <w:rPr>
+                                    <w:rFonts w:asciiTheme="majorHAnsi" w:eastAsiaTheme="majorEastAsia" w:hAnsiTheme="majorHAnsi" w:cstheme="majorBidi"/>
+                                    <w:caps/>
+                                    <w:color w:val="548DD4" w:themeColor="text2" w:themeTint="99"/>
+                                    <w:sz w:val="64"/>
+                                    <w:szCs w:val="64"/>
+                                  </w:rPr>
+                                  <w:t>Smart Campus IoT</w:t>
+                                </w:r>
+                                <w:r>
+                                  <w:rPr>
+                                    <w:rFonts w:asciiTheme="majorHAnsi" w:eastAsiaTheme="majorEastAsia" w:hAnsiTheme="majorHAnsi" w:cstheme="majorBidi"/>
+                                    <w:caps/>
+                                    <w:color w:val="548DD4" w:themeColor="text2" w:themeTint="99"/>
+                                    <w:sz w:val="64"/>
+                                    <w:szCs w:val="64"/>
+                                  </w:rPr>
+                                  <w:br/>
+                                  <w:t>Simulation and Analytics Platform</w:t>
+                                </w:r>
+                              </w:p>
+                              <w:sdt>
+                                <w:sdtPr>
+                                  <w:rPr>
+                                    <w:rFonts w:asciiTheme="majorHAnsi" w:eastAsiaTheme="majorEastAsia" w:hAnsiTheme="majorHAnsi" w:cstheme="majorBidi"/>
+                                    <w:caps/>
+                                    <w:color w:val="548DD4" w:themeColor="text2" w:themeTint="99"/>
+                                    <w:sz w:val="48"/>
+                                    <w:szCs w:val="48"/>
+                                  </w:rPr>
+                                  <w:alias w:val="Title"/>
+                                  <w:tag w:val=""/>
+                                  <w:id w:val="797192764"/>
+                                  <w:dataBinding w:prefixMappings="xmlns:ns0='http://purl.org/dc/elements/1.1/' xmlns:ns1='http://schemas.openxmlformats.org/package/2006/metadata/core-properties' " w:xpath="/ns1:coreProperties[1]/ns0:title[1]" w:storeItemID="{6C3C8BC8-F283-45AE-878A-BAB7291924A1}"/>
+                                  <w:text/>
+                                </w:sdtPr>
+                                <w:sdtContent>
+                                  <w:p>
+                                    <w:pPr>
+                                      <w:pStyle w:val="NoSpacing"/>
+                                      <w:jc w:val="center"/>
+                                      <w:rPr>
+                                        <w:rFonts w:asciiTheme="majorHAnsi" w:eastAsiaTheme="majorEastAsia" w:hAnsiTheme="majorHAnsi" w:cstheme="majorBidi"/>
+                                        <w:caps/>
+                                        <w:color w:val="548DD4" w:themeColor="text2" w:themeTint="99"/>
+                                        <w:sz w:val="48"/>
+                                        <w:szCs w:val="48"/>
+                                      </w:rPr>
+                                    </w:pPr>
+                                    <w:r>
+                                      <w:rPr>
+                                        <w:rFonts w:asciiTheme="majorHAnsi" w:eastAsiaTheme="majorEastAsia" w:hAnsiTheme="majorHAnsi" w:cstheme="majorBidi"/>
+                                        <w:caps/>
+                                        <w:color w:val="548DD4" w:themeColor="text2" w:themeTint="99"/>
+                                        <w:sz w:val="48"/>
+                                        <w:szCs w:val="48"/>
+                                      </w:rPr>
+                                      <w:t>Dr. Ammar Zahary</w:t>
+                                    </w:r>
+                                  </w:p>
+                                </w:sdtContent>
+                              </w:sdt>
+                            </w:txbxContent>
+                          </wps:txbx>
+                          <wps:bodyPr rot="0" spcFirstLastPara="0" vertOverflow="overflow" horzOverflow="overflow" vert="horz" wrap="square" lIns="91440" tIns="45720" rIns="91440" bIns="45720" numCol="1" spcCol="0" rtlCol="0" fromWordArt="0" anchor="t" anchorCtr="0" forceAA="0" compatLnSpc="1">
+                            <a:prstTxWarp prst="textNoShape">
+                              <a:avLst/>
+                            </a:prstTxWarp>
+                            <a:spAutoFit/>
+                          </wps:bodyPr>
+                        </wps:wsp>
+                      </a:graphicData>
+                    </a:graphic>
+                    <wp14:sizeRelH relativeFrom="page">
+                      <wp14:pctWidth>0</wp14:pctWidth>
+                    </wp14:sizeRelH>
+                  </wp:anchor>
+                </w:drawing>
+              </mc:Choice>
+              <mc:Fallback>
+                <w:pict>
+                  <v:shapetype w14:anchorId="460A4DAD" id="_x0000_t202" coordsize="21600,21600" o:spt="202" path="m,l,21600r21600,l21600,xe">
+                    <v:stroke joinstyle="miter"/>
+                    <v:path gradientshapeok="t" o:connecttype="rect"/>
+                  </v:shapetype>
+                  <v:shape id="Text Box 66" o:spid="_x0000_s1026" type="#_x0000_t202" style="position:absolute;margin-left:21.4pt;margin-top:17.35pt;width:568.15pt;height:1in;z-index:251660288;visibility:visible;mso-wrap-style:square;mso-width-percent:0;mso-wrap-distance-left:9pt;mso-wrap-distance-top:0;mso-wrap-distance-right:9pt;mso-wrap-distance-bottom:0;mso-position-horizontal:absolute;mso-position-horizontal-relative:page;mso-position-vertical:absolute;mso-position-vertical-relative:margin;mso-width-percent:0;mso-width-relative:page;v-text-anchor:top" o:gfxdata="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" filled="f" stroked="f" strokeweight=".5pt">
+                    <v:textbox style="mso-fit-shape-to-text:t">
+                      <w:txbxContent>
+                        <w:p>
+                          <w:pPr>
+                            <w:jc w:val="center"/>
+                            <w:rPr>
+                              <w:rFonts w:asciiTheme="majorHAnsi" w:eastAsiaTheme="majorEastAsia" w:hAnsiTheme="majorHAnsi" w:cstheme="majorBidi"/>
+                              <w:caps/>
+                              <w:color w:val="548DD4" w:themeColor="text2" w:themeTint="99"/>
+                              <w:sz w:val="64"/>
+                              <w:szCs w:val="64"/>
+                            </w:rPr>
+                          </w:pPr>
+                          <w:r>
+                            <w:rPr>
+                              <w:rFonts w:asciiTheme="majorHAnsi" w:eastAsiaTheme="majorEastAsia" w:hAnsiTheme="majorHAnsi" w:cstheme="majorBidi"/>
+                              <w:caps/>
+                              <w:color w:val="548DD4" w:themeColor="text2" w:themeTint="99"/>
+                              <w:sz w:val="64"/>
+                              <w:szCs w:val="64"/>
+                            </w:rPr>
+                            <w:t>Smart Campus IoT</w:t>
+                          </w:r>
+                          <w:r>
+                            <w:rPr>
+                              <w:rFonts w:asciiTheme="majorHAnsi" w:eastAsiaTheme="majorEastAsia" w:hAnsiTheme="majorHAnsi" w:cstheme="majorBidi"/>
+                              <w:caps/>
+                              <w:color w:val="548DD4" w:themeColor="text2" w:themeTint="99"/>
+                              <w:sz w:val="64"/>
+                              <w:szCs w:val="64"/>
+                            </w:rPr>
+                            <w:br/>
+                            <w:t>Simulation and Analytics Platform</w:t>
+                          </w:r>
+                        </w:p>
+                        <w:sdt>
+                          <w:sdtPr>
+                            <w:rPr>
+                              <w:rFonts w:asciiTheme="majorHAnsi" w:eastAsiaTheme="majorEastAsia" w:hAnsiTheme="majorHAnsi" w:cstheme="majorBidi"/>
+                              <w:caps/>
+                              <w:color w:val="548DD4" w:themeColor="text2" w:themeTint="99"/>
+                              <w:sz w:val="48"/>
+                              <w:szCs w:val="48"/>
+                            </w:rPr>
+                            <w:alias w:val="Title"/>
+                            <w:tag w:val=""/>
+                            <w:id w:val="797192764"/>
+                            <w:dataBinding w:prefixMappings="xmlns:ns0='http://purl.org/dc/elements/1.1/' xmlns:ns1='http://schemas.openxmlformats.org/package/2006/metadata/core-properties' " w:xpath="/ns1:coreProperties[1]/ns0:title[1]" w:storeItemID="{6C3C8BC8-F283-45AE-878A-BAB7291924A1}"/>
+                            <w:text/>
+                          </w:sdtPr>
+                          <w:sdtContent>
+                            <w:p>
+                              <w:pPr>
+                                <w:pStyle w:val="NoSpacing"/>
+                                <w:jc w:val="center"/>
+                                <w:rPr>
+                                  <w:rFonts w:asciiTheme="majorHAnsi" w:eastAsiaTheme="majorEastAsia" w:hAnsiTheme="majorHAnsi" w:cstheme="majorBidi"/>
+                                  <w:caps/>
+                                  <w:color w:val="548DD4" w:themeColor="text2" w:themeTint="99"/>
+                                  <w:sz w:val="48"/>
+                                  <w:szCs w:val="48"/>
+                                </w:rPr>
+                              </w:pPr>
+                              <w:r>
+                                <w:rPr>
+                                  <w:rFonts w:asciiTheme="majorHAnsi" w:eastAsiaTheme="majorEastAsia" w:hAnsiTheme="majorHAnsi" w:cstheme="majorBidi"/>
+                                  <w:caps/>
+                                  <w:color w:val="548DD4" w:themeColor="text2" w:themeTint="99"/>
+                                  <w:sz w:val="48"/>
+                                  <w:szCs w:val="48"/>
+                                </w:rPr>
+                                <w:t>Dr. Ammar Zahary</w:t>
+                              </w:r>
+                            </w:p>
+                          </w:sdtContent>
+                        </w:sdt>
+                      </w:txbxContent>
+                    </v:textbox>
+                    <w10:wrap anchorx="page" anchory="margin"/>
+                  </v:shape>
+                </w:pict>
+              </mc:Fallback>
+            </mc:AlternateContent>
+          </w:r>
+          <w:r>
+            <w:rPr>
+              <w:noProof/>
+              <w:color w:val="4F81BD" w:themeColor="accent1"/>
+              <w:sz w:val="36"/>
+              <w:szCs w:val="36"/>
+            </w:rPr>
+            <mc:AlternateContent>
+              <mc:Choice Requires="wpg">
+                <w:drawing>
+                  <wp:anchor distT="0" distB="0" distL="114300" distR="114300" simplePos="0" relativeHeight="251657216" behindDoc="1" locked="0" layoutInCell="1" allowOverlap="1" wp14:anchorId="44D89CE3" wp14:editId="4507850F">
+                    <wp:simplePos x="0" y="0"/>
+                    <mc:AlternateContent>
+                      <mc:Choice Requires="wp14">
+                        <wp:positionH relativeFrom="page">
+                          <wp14:pctPosHOffset>22000</wp14:pctPosHOffset>
+                        </wp:positionH>
+                      </mc:Choice>
+                      <mc:Fallback>
+                        <wp:positionH relativeFrom="page">
+                          <wp:posOffset>1709420</wp:posOffset>
+                        </wp:positionH>
+                      </mc:Fallback>
+                    </mc:AlternateContent>
+                    <mc:AlternateContent>
+                      <mc:Choice Requires="wp14">
+                        <wp:positionV relativeFrom="page">
+                          <wp14:pctPosVOffset>30000</wp14:pctPosVOffset>
+                        </wp:positionV>
+                      </mc:Choice>
+                      <mc:Fallback>
+                        <wp:positionV relativeFrom="page">
+                          <wp:posOffset>3017520</wp:posOffset>
+                        </wp:positionV>
+                      </mc:Fallback>
+                    </mc:AlternateContent>
+                    <wp:extent cx="5494369" cy="5696712"/>
+                    <wp:effectExtent l="0" t="0" r="0" b="3175"/>
+                    <wp:wrapNone/>
+                    <wp:docPr id="63" name="Group 2"/>
+                    <wp:cNvGraphicFramePr>
+                      <a:graphicFrameLocks xmlns:a="http://schemas.openxmlformats.org/drawingml/2006/main" noChangeAspect="1"/>
+                    </wp:cNvGraphicFramePr>
+                    <a:graphic xmlns:a="http://schemas.openxmlformats.org/drawingml/2006/main">
+                      <a:graphicData uri="http://schemas.microsoft.com/office/word/2010/wordprocessingGroup">
+                        <wpg:wgp>
+                          <wpg:cNvGrpSpPr>
+                            <a:grpSpLocks noChangeAspect="1"/>
+                          </wpg:cNvGrpSpPr>
+                          <wpg:grpSpPr>
+                            <a:xfrm>
+                              <a:off x="0" y="0"/>
+                              <a:ext cx="5494369" cy="5696712"/>
+                              <a:chOff x="0" y="0"/>
+                              <a:chExt cx="4329113" cy="4491038"/>
+                            </a:xfrm>
+                            <a:solidFill>
+                              <a:schemeClr val="tx2">
+                                <a:lumMod val="60000"/>
+                                <a:lumOff val="40000"/>
+                              </a:schemeClr>
+                            </a:solidFill>
+                          </wpg:grpSpPr>
+                          <wps:wsp>
+                            <wps:cNvPr id="64" name="Freeform 64"/>
+                            <wps:cNvSpPr>
+                              <a:spLocks/>
+                            </wps:cNvSpPr>
+                            <wps:spPr bwMode="auto">
+                              <a:xfrm>
+                                <a:off x="1501775" y="0"/>
+                                <a:ext cx="2827338" cy="2835275"/>
+                              </a:xfrm>
+                              <a:custGeom>
+                                <a:avLst/>
+                                <a:gdLst>
+                                  <a:gd name="T0" fmla="*/ 4 w 1781"/>
+                                  <a:gd name="T1" fmla="*/ 1786 h 1786"/>
+                                  <a:gd name="T2" fmla="*/ 0 w 1781"/>
+                                  <a:gd name="T3" fmla="*/ 1782 h 1786"/>
+                                  <a:gd name="T4" fmla="*/ 1776 w 1781"/>
+                                  <a:gd name="T5" fmla="*/ 0 h 1786"/>
+                                  <a:gd name="T6" fmla="*/ 1781 w 1781"/>
+                                  <a:gd name="T7" fmla="*/ 5 h 1786"/>
+                                  <a:gd name="T8" fmla="*/ 4 w 1781"/>
+                                  <a:gd name="T9" fmla="*/ 1786 h 1786"/>
+                                </a:gdLst>
+                                <a:ahLst/>
+                                <a:cxnLst>
+                                  <a:cxn ang="0">
+                                    <a:pos x="T0" y="T1"/>
+                                  </a:cxn>
+                                  <a:cxn ang="0">
+                                    <a:pos x="T2" y="T3"/>
+                                  </a:cxn>
+                                  <a:cxn ang="0">
+                                    <a:pos x="T4" y="T5"/>
+                                  </a:cxn>
+                                  <a:cxn ang="0">
+                                    <a:pos x="T6" y="T7"/>
+                                  </a:cxn>
+                                  <a:cxn ang="0">
+                                    <a:pos x="T8" y="T9"/>
+                                  </a:cxn>
+                                </a:cxnLst>
+                                <a:rect l="0" t="0" r="r" b="b"/>
+                                <a:pathLst>
+                                  <a:path w="1781" h="1786">
+                                    <a:moveTo>
+                                      <a:pt x="4" y="1786"/>
+                                    </a:moveTo>
+                                    <a:lnTo>
+                                      <a:pt x="0" y="1782"/>
+                                    </a:lnTo>
+                                    <a:lnTo>
+                                      <a:pt x="1776" y="0"/>
+                                    </a:lnTo>
+                                    <a:lnTo>
+                                      <a:pt x="1781" y="5"/>
+                                    </a:lnTo>
+                                    <a:lnTo>
+                                      <a:pt x="4" y="1786"/>
+                                    </a:lnTo>
+                                    <a:close/>
+                                  </a:path>
+                                </a:pathLst>
+                              </a:custGeom>
+                              <a:grpFill/>
+                              <a:ln>
+                                <a:noFill/>
+                              </a:ln>
+                              <a:extLst>
+                                <a:ext uri="{91240B29-F687-4F45-9708-019B960494DF}">
+                                  <a14:hiddenLine xmlns:a14="http://schemas.microsoft.com/office/drawing/2010/main" w="9525">
+                                    <a:solidFill>
+                                      <a:srgbClr val="000000"/>
+                                    </a:solidFill>
+                                    <a:round/>
+                                    <a:headEnd/>
+                                    <a:tailEnd/>
+                                  </a14:hiddenLine>
+                                </a:ext>
+                              </a:extLst>
+                            </wps:spPr>
+                            <wps:bodyPr vert="horz" wrap="square" lIns="91440" tIns="45720" rIns="91440" bIns="45720" numCol="1" anchor="t" anchorCtr="0" compatLnSpc="1">
+                              <a:prstTxWarp prst="textNoShape">
+                                <a:avLst/>
+                              </a:prstTxWarp>
+                            </wps:bodyPr>
+                          </wps:wsp>
+                          <wps:wsp>
+                            <wps:cNvPr id="65" name="Freeform 65"/>
+                            <wps:cNvSpPr>
+                              <a:spLocks/>
+                            </wps:cNvSpPr>
+                            <wps:spPr bwMode="auto">
+                              <a:xfrm>
+                                <a:off x="782637" y="227013"/>
+                                <a:ext cx="3546475" cy="3546475"/>
+                              </a:xfrm>
+                              <a:custGeom>
+                                <a:avLst/>
+                                <a:gdLst>
+                                  <a:gd name="T0" fmla="*/ 5 w 2234"/>
+                                  <a:gd name="T1" fmla="*/ 2234 h 2234"/>
+                                  <a:gd name="T2" fmla="*/ 0 w 2234"/>
+                                  <a:gd name="T3" fmla="*/ 2229 h 2234"/>
+                                  <a:gd name="T4" fmla="*/ 2229 w 2234"/>
+                                  <a:gd name="T5" fmla="*/ 0 h 2234"/>
+                                  <a:gd name="T6" fmla="*/ 2234 w 2234"/>
+                                  <a:gd name="T7" fmla="*/ 5 h 2234"/>
+                                  <a:gd name="T8" fmla="*/ 5 w 2234"/>
+                                  <a:gd name="T9" fmla="*/ 2234 h 2234"/>
+                                </a:gdLst>
+                                <a:ahLst/>
+                                <a:cxnLst>
+                                  <a:cxn ang="0">
+                                    <a:pos x="T0" y="T1"/>
+                                  </a:cxn>
+                                  <a:cxn ang="0">
+                                    <a:pos x="T2" y="T3"/>
+                                  </a:cxn>
+                                  <a:cxn ang="0">
+                                    <a:pos x="T4" y="T5"/>
+                                  </a:cxn>
+                                  <a:cxn ang="0">
+                                    <a:pos x="T6" y="T7"/>
+                                  </a:cxn>
+                                  <a:cxn ang="0">
+                                    <a:pos x="T8" y="T9"/>
+                                  </a:cxn>
+                                </a:cxnLst>
+                                <a:rect l="0" t="0" r="r" b="b"/>
+                                <a:pathLst>
+                                  <a:path w="2234" h="2234">
+                                    <a:moveTo>
+                                      <a:pt x="5" y="2234"/>
+                                    </a:moveTo>
+                                    <a:lnTo>
+                                      <a:pt x="0" y="2229"/>
+                                    </a:lnTo>
+                                    <a:lnTo>
+                                      <a:pt x="2229" y="0"/>
+                                    </a:lnTo>
+                                    <a:lnTo>
+                                      <a:pt x="2234" y="5"/>
+                                    </a:lnTo>
+                                    <a:lnTo>
+                                      <a:pt x="5" y="2234"/>
+                                    </a:lnTo>
+                                    <a:close/>
+                                  </a:path>
+                                </a:pathLst>
+                              </a:custGeom>
+                              <a:grpFill/>
+                              <a:ln>
+                                <a:noFill/>
+                              </a:ln>
+                              <a:extLst>
+                                <a:ext uri="{91240B29-F687-4F45-9708-019B960494DF}">
+                                  <a14:hiddenLine xmlns:a14="http://schemas.microsoft.com/office/drawing/2010/main" w="9525">
+                                    <a:solidFill>
+                                      <a:srgbClr val="000000"/>
+                                    </a:solidFill>
+                                    <a:round/>
+                                    <a:headEnd/>
+                                    <a:tailEnd/>
+                                  </a14:hiddenLine>
+                                </a:ext>
+                              </a:extLst>
+                            </wps:spPr>
+                            <wps:bodyPr vert="horz" wrap="square" lIns="91440" tIns="45720" rIns="91440" bIns="45720" numCol="1" anchor="t" anchorCtr="0" compatLnSpc="1">
+                              <a:prstTxWarp prst="textNoShape">
+                                <a:avLst/>
+                              </a:prstTxWarp>
+                            </wps:bodyPr>
+                          </wps:wsp>
+                          <wps:wsp>
+                            <wps:cNvPr id="66" name="Freeform 66"/>
+                            <wps:cNvSpPr>
+                              <a:spLocks/>
+                            </wps:cNvSpPr>
+                            <wps:spPr bwMode="auto">
+                              <a:xfrm>
+                                <a:off x="841375" y="109538"/>
+                                <a:ext cx="3487738" cy="3487738"/>
+                              </a:xfrm>
+                              <a:custGeom>
+                                <a:avLst/>
+                                <a:gdLst>
+                                  <a:gd name="T0" fmla="*/ 9 w 2197"/>
+                                  <a:gd name="T1" fmla="*/ 2197 h 2197"/>
+                                  <a:gd name="T2" fmla="*/ 0 w 2197"/>
+                                  <a:gd name="T3" fmla="*/ 2193 h 2197"/>
+                                  <a:gd name="T4" fmla="*/ 2188 w 2197"/>
+                                  <a:gd name="T5" fmla="*/ 0 h 2197"/>
+                                  <a:gd name="T6" fmla="*/ 2197 w 2197"/>
+                                  <a:gd name="T7" fmla="*/ 10 h 2197"/>
+                                  <a:gd name="T8" fmla="*/ 9 w 2197"/>
+                                  <a:gd name="T9" fmla="*/ 2197 h 2197"/>
+                                </a:gdLst>
+                                <a:ahLst/>
+                                <a:cxnLst>
+                                  <a:cxn ang="0">
+                                    <a:pos x="T0" y="T1"/>
+                                  </a:cxn>
+                                  <a:cxn ang="0">
+                                    <a:pos x="T2" y="T3"/>
+                                  </a:cxn>
+                                  <a:cxn ang="0">
+                                    <a:pos x="T4" y="T5"/>
+                                  </a:cxn>
+                                  <a:cxn ang="0">
+                                    <a:pos x="T6" y="T7"/>
+                                  </a:cxn>
+                                  <a:cxn ang="0">
+                                    <a:pos x="T8" y="T9"/>
+                                  </a:cxn>
+                                </a:cxnLst>
+                                <a:rect l="0" t="0" r="r" b="b"/>
+                                <a:pathLst>
+                                  <a:path w="2197" h="2197">
+                                    <a:moveTo>
+                                      <a:pt x="9" y="2197"/>
+                                    </a:moveTo>
+                                    <a:lnTo>
+                                      <a:pt x="0" y="2193"/>
+                                    </a:lnTo>
+                                    <a:lnTo>
+                                      <a:pt x="2188" y="0"/>
+                                    </a:lnTo>
+                                    <a:lnTo>
+                                      <a:pt x="2197" y="10"/>
+                                    </a:lnTo>
+                                    <a:lnTo>
+                                      <a:pt x="9" y="2197"/>
+                                    </a:lnTo>
+                                    <a:close/>
+                                  </a:path>
+                                </a:pathLst>
+                              </a:custGeom>
+                              <a:grpFill/>
+                              <a:ln>
+                                <a:noFill/>
+                              </a:ln>
+                              <a:extLst>
+                                <a:ext uri="{91240B29-F687-4F45-9708-019B960494DF}">
+                                  <a14:hiddenLine xmlns:a14="http://schemas.microsoft.com/office/drawing/2010/main" w="9525">
+                                    <a:solidFill>
+                                      <a:srgbClr val="000000"/>
+                                    </a:solidFill>
+                                    <a:round/>
+                                    <a:headEnd/>
+                                    <a:tailEnd/>
+                                  </a14:hiddenLine>
+                                </a:ext>
+                              </a:extLst>
+                            </wps:spPr>
+                            <wps:bodyPr vert="horz" wrap="square" lIns="91440" tIns="45720" rIns="91440" bIns="45720" numCol="1" anchor="t" anchorCtr="0" compatLnSpc="1">
+                              <a:prstTxWarp prst="textNoShape">
+                                <a:avLst/>
+                              </a:prstTxWarp>
+                            </wps:bodyPr>
+                          </wps:wsp>
+                          <wps:wsp>
+                            <wps:cNvPr id="67" name="Freeform 67"/>
+                            <wps:cNvSpPr>
+                              <a:spLocks/>
+                            </wps:cNvSpPr>
+                            <wps:spPr bwMode="auto">
+                              <a:xfrm>
+                                <a:off x="1216025" y="498475"/>
+                                <a:ext cx="3113088" cy="3121025"/>
+                              </a:xfrm>
+                              <a:custGeom>
+                                <a:avLst/>
+                                <a:gdLst>
+                                  <a:gd name="T0" fmla="*/ 9 w 1961"/>
+                                  <a:gd name="T1" fmla="*/ 1966 h 1966"/>
+                                  <a:gd name="T2" fmla="*/ 0 w 1961"/>
+                                  <a:gd name="T3" fmla="*/ 1957 h 1966"/>
+                                  <a:gd name="T4" fmla="*/ 1952 w 1961"/>
+                                  <a:gd name="T5" fmla="*/ 0 h 1966"/>
+                                  <a:gd name="T6" fmla="*/ 1961 w 1961"/>
+                                  <a:gd name="T7" fmla="*/ 9 h 1966"/>
+                                  <a:gd name="T8" fmla="*/ 9 w 1961"/>
+                                  <a:gd name="T9" fmla="*/ 1966 h 1966"/>
+                                </a:gdLst>
+                                <a:ahLst/>
+                                <a:cxnLst>
+                                  <a:cxn ang="0">
+                                    <a:pos x="T0" y="T1"/>
+                                  </a:cxn>
+                                  <a:cxn ang="0">
+                                    <a:pos x="T2" y="T3"/>
+                                  </a:cxn>
+                                  <a:cxn ang="0">
+                                    <a:pos x="T4" y="T5"/>
+                                  </a:cxn>
+                                  <a:cxn ang="0">
+                                    <a:pos x="T6" y="T7"/>
+                                  </a:cxn>
+                                  <a:cxn ang="0">
+                                    <a:pos x="T8" y="T9"/>
+                                  </a:cxn>
+                                </a:cxnLst>
+                                <a:rect l="0" t="0" r="r" b="b"/>
+                                <a:pathLst>
+                                  <a:path w="1961" h="1966">
+                                    <a:moveTo>
+                                      <a:pt x="9" y="1966"/>
+                                    </a:moveTo>
+                                    <a:lnTo>
+                                      <a:pt x="0" y="1957"/>
+                                    </a:lnTo>
+                                    <a:lnTo>
+                                      <a:pt x="1952" y="0"/>
+                                    </a:lnTo>
+                                    <a:lnTo>
+                                      <a:pt x="1961" y="9"/>
+                                    </a:lnTo>
+                                    <a:lnTo>
+                                      <a:pt x="9" y="1966"/>
+                                    </a:lnTo>
+                                    <a:close/>
+                                  </a:path>
+                                </a:pathLst>
+                              </a:custGeom>
+                              <a:grpFill/>
+                              <a:ln>
+                                <a:noFill/>
+                              </a:ln>
+                              <a:extLst>
+                                <a:ext uri="{91240B29-F687-4F45-9708-019B960494DF}">
+                                  <a14:hiddenLine xmlns:a14="http://schemas.microsoft.com/office/drawing/2010/main" w="9525">
+                                    <a:solidFill>
+                                      <a:srgbClr val="000000"/>
+                                    </a:solidFill>
+                                    <a:round/>
+                                    <a:headEnd/>
+                                    <a:tailEnd/>
+                                  </a14:hiddenLine>
+                                </a:ext>
+                              </a:extLst>
+                            </wps:spPr>
+                            <wps:bodyPr vert="horz" wrap="square" lIns="91440" tIns="45720" rIns="91440" bIns="45720" numCol="1" anchor="t" anchorCtr="0" compatLnSpc="1">
+                              <a:prstTxWarp prst="textNoShape">
+                                <a:avLst/>
+                              </a:prstTxWarp>
+                            </wps:bodyPr>
+                          </wps:wsp>
+                          <wps:wsp>
+                            <wps:cNvPr id="68" name="Freeform 68"/>
+                            <wps:cNvSpPr>
+                              <a:spLocks/>
+                            </wps:cNvSpPr>
+                            <wps:spPr bwMode="auto">
+                              <a:xfrm>
+                                <a:off x="0" y="153988"/>
+                                <a:ext cx="4329113" cy="4337050"/>
+                              </a:xfrm>
+                              <a:custGeom>
+                                <a:avLst/>
+                                <a:gdLst>
+                                  <a:gd name="T0" fmla="*/ 0 w 2727"/>
+                                  <a:gd name="T1" fmla="*/ 2732 h 2732"/>
+                                  <a:gd name="T2" fmla="*/ 0 w 2727"/>
+                                  <a:gd name="T3" fmla="*/ 2728 h 2732"/>
+                                  <a:gd name="T4" fmla="*/ 2722 w 2727"/>
+                                  <a:gd name="T5" fmla="*/ 0 h 2732"/>
+                                  <a:gd name="T6" fmla="*/ 2727 w 2727"/>
+                                  <a:gd name="T7" fmla="*/ 5 h 2732"/>
+                                  <a:gd name="T8" fmla="*/ 0 w 2727"/>
+                                  <a:gd name="T9" fmla="*/ 2732 h 2732"/>
+                                </a:gdLst>
+                                <a:ahLst/>
+                                <a:cxnLst>
+                                  <a:cxn ang="0">
+                                    <a:pos x="T0" y="T1"/>
+                                  </a:cxn>
+                                  <a:cxn ang="0">
+                                    <a:pos x="T2" y="T3"/>
+                                  </a:cxn>
+                                  <a:cxn ang="0">
+                                    <a:pos x="T4" y="T5"/>
+                                  </a:cxn>
+                                  <a:cxn ang="0">
+                                    <a:pos x="T6" y="T7"/>
+                                  </a:cxn>
+                                  <a:cxn ang="0">
+                                    <a:pos x="T8" y="T9"/>
+                                  </a:cxn>
+                                </a:cxnLst>
+                                <a:rect l="0" t="0" r="r" b="b"/>
+                                <a:pathLst>
+                                  <a:path w="2727" h="2732">
+                                    <a:moveTo>
+                                      <a:pt x="0" y="2732"/>
+                                    </a:moveTo>
+                                    <a:lnTo>
+                                      <a:pt x="0" y="2728"/>
+                                    </a:lnTo>
+                                    <a:lnTo>
+                                      <a:pt x="2722" y="0"/>
+                                    </a:lnTo>
+                                    <a:lnTo>
+                                      <a:pt x="2727" y="5"/>
+                                    </a:lnTo>
+                                    <a:lnTo>
+                                      <a:pt x="0" y="2732"/>
+                                    </a:lnTo>
+                                    <a:close/>
+                                  </a:path>
+                                </a:pathLst>
+                              </a:custGeom>
+                              <a:grpFill/>
+                              <a:ln>
+                                <a:noFill/>
+                              </a:ln>
+                              <a:extLst>
+                                <a:ext uri="{91240B29-F687-4F45-9708-019B960494DF}">
+                                  <a14:hiddenLine xmlns:a14="http://schemas.microsoft.com/office/drawing/2010/main" w="9525">
+                                    <a:solidFill>
+                                      <a:srgbClr val="000000"/>
+                                    </a:solidFill>
+                                    <a:round/>
+                                    <a:headEnd/>
+                                    <a:tailEnd/>
+                                  </a14:hiddenLine>
+                                </a:ext>
+                              </a:extLst>
+                            </wps:spPr>
+                            <wps:bodyPr vert="horz" wrap="square" lIns="91440" tIns="45720" rIns="91440" bIns="45720" numCol="1" anchor="t" anchorCtr="0" compatLnSpc="1">
+                              <a:prstTxWarp prst="textNoShape">
+                                <a:avLst/>
+                              </a:prstTxWarp>
+                            </wps:bodyPr>
+                          </wps:wsp>
+                        </wpg:wgp>
+                      </a:graphicData>
+                    </a:graphic>
+                    <wp14:sizeRelH relativeFrom="page">
+                      <wp14:pctWidth>70600</wp14:pctWidth>
+                    </wp14:sizeRelH>
+                    <wp14:sizeRelV relativeFrom="page">
+                      <wp14:pctHeight>56600</wp14:pctHeight>
+                    </wp14:sizeRelV>
+                  </wp:anchor>
+                </w:drawing>
+              </mc:Choice>
+              <mc:Fallback>
+                <w:pict>
+                  <v:group w14:anchorId="29A78B88" id="Group 2" o:spid="_x0000_s1026" style="position:absolute;margin-left:0;margin-top:0;width:432.65pt;height:448.55pt;z-index:-251659264;mso-width-percent:706;mso-height-percent:566;mso-left-percent:220;mso-top-percent:300;mso-position-horizontal-relative:page;mso-position-vertical-relative:page;mso-width-percent:706;mso-height-percent:566;mso-left-percent:220;mso-top-percent:300" coordsize="43291,44910" o:gfxdata="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">
+                    <o:lock v:ext="edit" aspectratio="t"/>
+                    <v:shape id="Freeform 64" o:spid="_x0000_s1027" style="position:absolute;left:15017;width:28274;height:28352;visibility:visible;mso-wrap-style:square;v-text-anchor:top" coordsize="1781,1786" o:gfxdata="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" path="m4,1786l,1782,1776,r5,5l4,1786xe" filled="f" stroked="f">
+                      <v:path arrowok="t" o:connecttype="custom" o:connectlocs="6350,2835275;0,2828925;2819400,0;2827338,7938;6350,2835275" o:connectangles="0,0,0,0,0"/>
+                    </v:shape>
+                    <v:shape id="Freeform 65" o:spid="_x0000_s1028" style="position:absolute;left:7826;top:2270;width:35465;height:35464;visibility:visible;mso-wrap-style:square;v-text-anchor:top" coordsize="2234,2234" o:gfxdata="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" path="m5,2234l,2229,2229,r5,5l5,2234xe" filled="f" stroked="f">
+                      <v:path arrowok="t" o:connecttype="custom" o:connectlocs="7938,3546475;0,3538538;3538538,0;3546475,7938;7938,3546475" o:connectangles="0,0,0,0,0"/>
+                    </v:shape>
+                    <v:shape id="Freeform 66" o:spid="_x0000_s1029" style="position:absolute;left:8413;top:1095;width:34878;height:34877;visibility:visible;mso-wrap-style:square;v-text-anchor:top" coordsize="2197,2197" o:gfxdata="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" path="m9,2197l,2193,2188,r9,10l9,2197xe" filled="f" stroked="f">
+                      <v:path arrowok="t" o:connecttype="custom" o:connectlocs="14288,3487738;0,3481388;3473450,0;3487738,15875;14288,3487738" o:connectangles="0,0,0,0,0"/>
+                    </v:shape>
+                    <v:shape id="Freeform 67" o:spid="_x0000_s1030" style="position:absolute;left:12160;top:4984;width:31131;height:31211;visibility:visible;mso-wrap-style:square;v-text-anchor:top" coordsize="1961,1966" o:gfxdata="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" path="m9,1966l,1957,1952,r9,9l9,1966xe" filled="f" stroked="f">
+                      <v:path arrowok="t" o:connecttype="custom" o:connectlocs="14288,3121025;0,3106738;3098800,0;3113088,14288;14288,3121025" o:connectangles="0,0,0,0,0"/>
+                    </v:shape>
+                    <v:shape id="Freeform 68" o:spid="_x0000_s1031" style="position:absolute;top:1539;width:43291;height:43371;visibility:visible;mso-wrap-style:square;v-text-anchor:top" coordsize="2727,2732" o:gfxdata="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" path="m,2732r,-4l2722,r5,5l,2732xe" filled="f" stroked="f">
+                      <v:path arrowok="t" o:connecttype="custom" o:connectlocs="0,4337050;0,4330700;4321175,0;4329113,7938;0,4337050" o:connectangles="0,0,0,0,0"/>
+                    </v:shape>
+                    <w10:wrap anchorx="page" anchory="page"/>
+                  </v:group>
+                </w:pict>
+              </mc:Fallback>
+            </mc:AlternateContent>
+          </w:r>
+        </w:p>
+        <w:p>
+          <w:pPr>
+            <w:rPr>
+              <w:b/>
+              <w:color w:val="1F4588"/>
+              <w:sz w:val="44"/>
+            </w:rPr>
+          </w:pPr>
+          <w:r>
+            <w:rPr>
+              <w:noProof/>
+            </w:rPr>
+            <mc:AlternateContent>
+              <mc:Choice Requires="wps">
+                <w:drawing>
+                  <wp:anchor distT="0" distB="0" distL="114300" distR="114300" simplePos="0" relativeHeight="251662336" behindDoc="0" locked="0" layoutInCell="1" allowOverlap="1" wp14:anchorId="5203C4BC" wp14:editId="13CA5C7A">
+                    <wp:simplePos x="0" y="0"/>
+                    <wp:positionH relativeFrom="page">
+                      <wp:posOffset>724824</wp:posOffset>
+                    </wp:positionH>
+                    <wp:positionV relativeFrom="margin">
+                      <wp:posOffset>2472382</wp:posOffset>
+                    </wp:positionV>
+                    <wp:extent cx="5943600" cy="374904"/>
+                    <wp:effectExtent l="0" t="0" r="0" b="2540"/>
+                    <wp:wrapNone/>
+                    <wp:docPr id="518953936" name="Text Box 73"/>
+                    <wp:cNvGraphicFramePr/>
+                    <a:graphic xmlns:a="http://schemas.openxmlformats.org/drawingml/2006/main">
+                      <a:graphicData uri="http://schemas.microsoft.com/office/word/2010/wordprocessingShape">
+                        <wps:wsp>
+                          <wps:cNvSpPr txBox="1"/>
+                          <wps:spPr>
+                            <a:xfrm>
+                              <a:off x="0" y="0"/>
+                              <a:ext cx="5943600" cy="374904"/>
+                            </a:xfrm>
+                            <a:prstGeom prst="rect">
+                              <a:avLst/>
+                            </a:prstGeom>
+                            <a:noFill/>
+                            <a:ln w="6350">
+                              <a:noFill/>
+                            </a:ln>
+                            <a:effectLst/>
+                          </wps:spPr>
+                          <wps:style>
+                            <a:lnRef idx="0">
+                              <a:schemeClr val="accent1"/>
+                            </a:lnRef>
+                            <a:fillRef idx="0">
+                              <a:schemeClr val="accent1"/>
+                            </a:fillRef>
+                            <a:effectRef idx="0">
+                              <a:schemeClr val="accent1"/>
+                            </a:effectRef>
+                            <a:fontRef idx="minor">
+                              <a:schemeClr val="dk1"/>
+                            </a:fontRef>
+                          </wps:style>
+                          <wps:txbx>
+                            <w:txbxContent>
+                              <w:p>
+                                <w:pPr>
+                                  <w:jc w:val="center"/>
+                                  <w:rPr>
+                                    <w:sz w:val="36"/>
+                                    <w:szCs w:val="36"/>
+                                  </w:rPr>
+                                </w:pPr>
+                                <w:r>
+                                  <w:rPr>
+                                    <w:sz w:val="36"/>
+                                    <w:szCs w:val="36"/>
+                                  </w:rPr>
+                                  <w:t>Team Members:</w:t>
+                                </w:r>
+                              </w:p>
+                              <w:p>
+                                <w:pPr>
+                                  <w:jc w:val="center"/>
+                                </w:pPr>
+                                <w:r>
+                                  <w:rPr>
+                                    <w:sz w:val="36"/>
+                                    <w:szCs w:val="36"/>
+                                  </w:rPr>
+                                  <w:t>1. Osama Haider</w:t>
+                                </w:r>
+                                <w:r>
+                                  <w:rPr>
+                                    <w:sz w:val="36"/>
+                                    <w:szCs w:val="36"/>
+                                  </w:rPr>
+                                  <w:br/>
+                                </w:r>
+                                <w:r>
+                                  <w:rPr>
+                                    <w:sz w:val="36"/>
+                                    <w:szCs w:val="36"/>
+                                  </w:rPr>
+                                  <w:t xml:space="preserve">  </w:t>
+                                </w:r>
+                                <w:r>
+                                  <w:rPr>
+                                    <w:sz w:val="36"/>
+                                    <w:szCs w:val="36"/>
+                                  </w:rPr>
+                                  <w:t>2. Saba Al-</w:t>
+                                </w:r>
+                                <w:proofErr w:type="spellStart"/>
+                                <w:r>
+                                  <w:rPr>
+                                    <w:sz w:val="36"/>
+                                    <w:szCs w:val="36"/>
+                                  </w:rPr>
+                                  <w:t>wesabi</w:t>
+                                </w:r>
+                                <w:proofErr w:type="spellEnd"/>
+                              </w:p>
+                              <w:p>
+                                <w:pPr>
+                                  <w:pStyle w:val="NoSpacing"/>
+                                  <w:jc w:val="center"/>
+                                  <w:rPr>
+                                    <w:color w:val="4F81BD" w:themeColor="accent1"/>
+                                    <w:sz w:val="36"/>
+                                    <w:szCs w:val="36"/>
+                                  </w:rPr>
+                                </w:pPr>
+                              </w:p>
+                            </w:txbxContent>
+                          </wps:txbx>
+                          <wps:bodyPr rot="0" spcFirstLastPara="0" vertOverflow="overflow" horzOverflow="overflow" vert="horz" wrap="square" lIns="0" tIns="0" rIns="0" bIns="0" numCol="1" spcCol="0" rtlCol="0" fromWordArt="0" anchor="b" anchorCtr="0" forceAA="0" compatLnSpc="1">
+                            <a:prstTxWarp prst="textNoShape">
+                              <a:avLst/>
+                            </a:prstTxWarp>
+                            <a:spAutoFit/>
+                          </wps:bodyPr>
+                        </wps:wsp>
+                      </a:graphicData>
+                    </a:graphic>
+                    <wp14:sizeRelH relativeFrom="page">
+                      <wp14:pctWidth>76500</wp14:pctWidth>
+                    </wp14:sizeRelH>
+                    <wp14:sizeRelV relativeFrom="margin">
+                      <wp14:pctHeight>0</wp14:pctHeight>
+                    </wp14:sizeRelV>
+                  </wp:anchor>
+                </w:drawing>
+              </mc:Choice>
+              <mc:Fallback>
+                <w:pict>
+                  <v:shape w14:anchorId="5203C4BC" id="Text Box 73" o:spid="_x0000_s1027" type="#_x0000_t202" style="position:absolute;margin-left:57.05pt;margin-top:194.7pt;width:468pt;height:29.5pt;z-index:251662336;visibility:visible;mso-wrap-style:square;mso-width-percent:765;mso-height-percent:0;mso-wrap-distance-left:9pt;mso-wrap-distance-top:0;mso-wrap-distance-right:9pt;mso-wrap-distance-bottom:0;mso-position-horizontal:absolute;mso-position-horizontal-relative:page;mso-position-vertical:absolute;mso-position-vertical-relative:margin;mso-width-percent:765;mso-height-percent:0;mso-width-relative:page;mso-height-relative:margin;v-text-anchor:bottom" o:gfxdata="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" filled="f" stroked="f" strokeweight=".5pt">
+                    <v:textbox style="mso-fit-shape-to-text:t" inset="0,0,0,0">
+                      <w:txbxContent>
+                        <w:p>
+                          <w:pPr>
+                            <w:jc w:val="center"/>
+                            <w:rPr>
+                              <w:sz w:val="36"/>
+                              <w:szCs w:val="36"/>
+                            </w:rPr>
+                          </w:pPr>
+                          <w:r>
+                            <w:rPr>
+                              <w:sz w:val="36"/>
+                              <w:szCs w:val="36"/>
+                            </w:rPr>
+                            <w:t>Team Members:</w:t>
+                          </w:r>
+                        </w:p>
+                        <w:p>
+                          <w:pPr>
+                            <w:jc w:val="center"/>
+                          </w:pPr>
+                          <w:r>
+                            <w:rPr>
+                              <w:sz w:val="36"/>
+                              <w:szCs w:val="36"/>
+                            </w:rPr>
+                            <w:t>1. Osama Haider</w:t>
+                          </w:r>
+                          <w:r>
+                            <w:rPr>
+                              <w:sz w:val="36"/>
+                              <w:szCs w:val="36"/>
+                            </w:rPr>
+                            <w:br/>
+                          </w:r>
+                          <w:r>
+                            <w:rPr>
+                              <w:sz w:val="36"/>
+                              <w:szCs w:val="36"/>
+                            </w:rPr>
+                            <w:t xml:space="preserve">  </w:t>
+                          </w:r>
+                          <w:r>
+                            <w:rPr>
+                              <w:sz w:val="36"/>
+                              <w:szCs w:val="36"/>
+                            </w:rPr>
+                            <w:t>2. Saba Al-</w:t>
+                          </w:r>
+                          <w:proofErr w:type="spellStart"/>
+                          <w:r>
+                            <w:rPr>
+                              <w:sz w:val="36"/>
+                              <w:szCs w:val="36"/>
+                            </w:rPr>
+                            <w:t>wesabi</w:t>
+                          </w:r>
+                          <w:proofErr w:type="spellEnd"/>
+                        </w:p>
+                        <w:p>
+                          <w:pPr>
+                            <w:pStyle w:val="NoSpacing"/>
+                            <w:jc w:val="center"/>
+                            <w:rPr>
+                              <w:color w:val="4F81BD" w:themeColor="accent1"/>
+                              <w:sz w:val="36"/>
+                              <w:szCs w:val="36"/>
+                            </w:rPr>
+                          </w:pPr>
+                        </w:p>
+                      </w:txbxContent>
+                    </v:textbox>
+                    <w10:wrap anchorx="page" anchory="margin"/>
+                  </v:shape>
+                </w:pict>
+              </mc:Fallback>
+            </mc:AlternateContent>
+          </w:r>
+          <w:r>
+            <w:rPr>
+              <w:noProof/>
+            </w:rPr>
+            <mc:AlternateContent>
+              <mc:Choice Requires="wps">
+                <w:drawing>
+                  <wp:anchor distT="0" distB="0" distL="114300" distR="114300" simplePos="0" relativeHeight="251656192" behindDoc="0" locked="0" layoutInCell="1" allowOverlap="1" wp14:anchorId="4C886D0F" wp14:editId="4CD61697">
+                    <wp:simplePos x="0" y="0"/>
+                    <wp:positionH relativeFrom="page">
+                      <wp:posOffset>1447209</wp:posOffset>
+                    </wp:positionH>
+                    <wp:positionV relativeFrom="margin">
+                      <wp:posOffset>8100487</wp:posOffset>
+                    </wp:positionV>
+                    <wp:extent cx="5943600" cy="374904"/>
+                    <wp:effectExtent l="0" t="0" r="0" b="2540"/>
+                    <wp:wrapNone/>
+                    <wp:docPr id="69" name="Text Box 73"/>
+                    <wp:cNvGraphicFramePr/>
+                    <a:graphic xmlns:a="http://schemas.openxmlformats.org/drawingml/2006/main">
+                      <a:graphicData uri="http://schemas.microsoft.com/office/word/2010/wordprocessingShape">
+                        <wps:wsp>
+                          <wps:cNvSpPr txBox="1"/>
+                          <wps:spPr>
+                            <a:xfrm>
+                              <a:off x="0" y="0"/>
+                              <a:ext cx="5943600" cy="374904"/>
+                            </a:xfrm>
+                            <a:prstGeom prst="rect">
+                              <a:avLst/>
+                            </a:prstGeom>
+                            <a:noFill/>
+                            <a:ln w="6350">
+                              <a:noFill/>
+                            </a:ln>
+                            <a:effectLst/>
+                          </wps:spPr>
+                          <wps:style>
+                            <a:lnRef idx="0">
+                              <a:schemeClr val="accent1"/>
+                            </a:lnRef>
+                            <a:fillRef idx="0">
+                              <a:schemeClr val="accent1"/>
+                            </a:fillRef>
+                            <a:effectRef idx="0">
+                              <a:schemeClr val="accent1"/>
+                            </a:effectRef>
+                            <a:fontRef idx="minor">
+                              <a:schemeClr val="dk1"/>
+                            </a:fontRef>
+                          </wps:style>
+                          <wps:txbx>
+                            <w:txbxContent>
+                              <w:p>
+                                <w:pPr>
+                                  <w:pStyle w:val="NoSpacing"/>
+                                  <w:jc w:val="right"/>
+                                  <w:rPr>
+                                    <w:color w:val="4F81BD" w:themeColor="accent1"/>
+                                    <w:sz w:val="36"/>
+                                    <w:szCs w:val="36"/>
+                                  </w:rPr>
+                                </w:pPr>
+                                <w:r>
+                                  <w:rPr>
+                                    <w:color w:val="4F81BD" w:themeColor="accent1"/>
+                                    <w:sz w:val="36"/>
+                                    <w:szCs w:val="36"/>
+                                  </w:rPr>
+                                  <w:t>Internet of Things</w:t>
+                                </w:r>
+                              </w:p>
+                              <w:p>
+                                <w:pPr>
+                                  <w:pStyle w:val="NoSpacing"/>
+                                  <w:jc w:val="right"/>
+                                  <w:rPr>
+                                    <w:color w:val="4F81BD" w:themeColor="accent1"/>
+                                    <w:sz w:val="36"/>
+                                    <w:szCs w:val="36"/>
+                                  </w:rPr>
+                                </w:pPr>
+                                <w:r>
+                                  <w:rPr>
+                                    <w:color w:val="4F81BD" w:themeColor="accent1"/>
+                                    <w:sz w:val="36"/>
+                                    <w:szCs w:val="36"/>
+                                  </w:rPr>
+                                  <w:t xml:space="preserve"> </w:t>
+                                </w:r>
+                                <w:sdt>
+                                  <w:sdtPr>
+                                    <w:rPr>
+                                      <w:color w:val="4F81BD" w:themeColor="accent1"/>
+                                      <w:sz w:val="36"/>
+                                      <w:szCs w:val="36"/>
+                                    </w:rPr>
+                                    <w:alias w:val="Course"/>
+                                    <w:tag w:val="Course"/>
+                                    <w:id w:val="1717703537"/>
+                                    <w:dataBinding w:prefixMappings="xmlns:ns0='http://purl.org/dc/elements/1.1/' xmlns:ns1='http://schemas.openxmlformats.org/package/2006/metadata/core-properties' " w:xpath="/ns1:coreProperties[1]/ns1:category[1]" w:storeItemID="{6C3C8BC8-F283-45AE-878A-BAB7291924A1}"/>
+                                    <w:text/>
+                                  </w:sdtPr>
+                                  <w:sdtContent>
+                                    <w:r>
+                                      <w:rPr>
+                                        <w:color w:val="4F81BD" w:themeColor="accent1"/>
+                                        <w:sz w:val="36"/>
+                                        <w:szCs w:val="36"/>
+                                      </w:rPr>
+                                      <w:t>Master of IT</w:t>
+                                    </w:r>
+                                  </w:sdtContent>
+                                </w:sdt>
+                              </w:p>
+                            </w:txbxContent>
+                          </wps:txbx>
+                          <wps:bodyPr rot="0" spcFirstLastPara="0" vertOverflow="overflow" horzOverflow="overflow" vert="horz" wrap="square" lIns="0" tIns="0" rIns="0" bIns="0" numCol="1" spcCol="0" rtlCol="0" fromWordArt="0" anchor="b" anchorCtr="0" forceAA="0" compatLnSpc="1">
+                            <a:prstTxWarp prst="textNoShape">
+                              <a:avLst/>
+                            </a:prstTxWarp>
+                            <a:spAutoFit/>
+                          </wps:bodyPr>
+                        </wps:wsp>
+                      </a:graphicData>
+                    </a:graphic>
+                    <wp14:sizeRelH relativeFrom="page">
+                      <wp14:pctWidth>76500</wp14:pctWidth>
+                    </wp14:sizeRelH>
+                    <wp14:sizeRelV relativeFrom="margin">
+                      <wp14:pctHeight>0</wp14:pctHeight>
+                    </wp14:sizeRelV>
+                  </wp:anchor>
+                </w:drawing>
+              </mc:Choice>
+              <mc:Fallback>
+                <w:pict>
+                  <v:shape w14:anchorId="4C886D0F" id="_x0000_s1028" type="#_x0000_t202" style="position:absolute;margin-left:113.95pt;margin-top:637.85pt;width:468pt;height:29.5pt;z-index:251656192;visibility:visible;mso-wrap-style:square;mso-width-percent:765;mso-height-percent:0;mso-wrap-distance-left:9pt;mso-wrap-distance-top:0;mso-wrap-distance-right:9pt;mso-wrap-distance-bottom:0;mso-position-horizontal:absolute;mso-position-horizontal-relative:page;mso-position-vertical:absolute;mso-position-vertical-relative:margin;mso-width-percent:765;mso-height-percent:0;mso-width-relative:page;mso-height-relative:margin;v-text-anchor:bottom" o:gfxdata="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" filled="f" stroked="f" strokeweight=".5pt">
+                    <v:textbox style="mso-fit-shape-to-text:t" inset="0,0,0,0">
+                      <w:txbxContent>
+                        <w:p>
+                          <w:pPr>
+                            <w:pStyle w:val="NoSpacing"/>
+                            <w:jc w:val="right"/>
+                            <w:rPr>
+                              <w:color w:val="4F81BD" w:themeColor="accent1"/>
+                              <w:sz w:val="36"/>
+                              <w:szCs w:val="36"/>
+                            </w:rPr>
+                          </w:pPr>
+                          <w:r>
+                            <w:rPr>
+                              <w:color w:val="4F81BD" w:themeColor="accent1"/>
+                              <w:sz w:val="36"/>
+                              <w:szCs w:val="36"/>
+                            </w:rPr>
+                            <w:t>Internet of Things</w:t>
+                          </w:r>
+                        </w:p>
+                        <w:p>
+                          <w:pPr>
+                            <w:pStyle w:val="NoSpacing"/>
+                            <w:jc w:val="right"/>
+                            <w:rPr>
+                              <w:color w:val="4F81BD" w:themeColor="accent1"/>
+                              <w:sz w:val="36"/>
+                              <w:szCs w:val="36"/>
+                            </w:rPr>
+                          </w:pPr>
+                          <w:r>
+                            <w:rPr>
+                              <w:color w:val="4F81BD" w:themeColor="accent1"/>
+                              <w:sz w:val="36"/>
+                              <w:szCs w:val="36"/>
+                            </w:rPr>
+                            <w:t xml:space="preserve"> </w:t>
+                          </w:r>
+                          <w:sdt>
+                            <w:sdtPr>
+                              <w:rPr>
+                                <w:color w:val="4F81BD" w:themeColor="accent1"/>
+                                <w:sz w:val="36"/>
+                                <w:szCs w:val="36"/>
+                              </w:rPr>
+                              <w:alias w:val="Course"/>
+                              <w:tag w:val="Course"/>
+                              <w:id w:val="1717703537"/>
+                              <w:dataBinding w:prefixMappings="xmlns:ns0='http://purl.org/dc/elements/1.1/' xmlns:ns1='http://schemas.openxmlformats.org/package/2006/metadata/core-properties' " w:xpath="/ns1:coreProperties[1]/ns1:category[1]" w:storeItemID="{6C3C8BC8-F283-45AE-878A-BAB7291924A1}"/>
+                              <w:text/>
+                            </w:sdtPr>
+                            <w:sdtContent>
+                              <w:r>
+                                <w:rPr>
+                                  <w:color w:val="4F81BD" w:themeColor="accent1"/>
+                                  <w:sz w:val="36"/>
+                                  <w:szCs w:val="36"/>
+                                </w:rPr>
+                                <w:t>Master of IT</w:t>
+                              </w:r>
+                            </w:sdtContent>
+                          </w:sdt>
+                        </w:p>
+                      </w:txbxContent>
+                    </v:textbox>
+                    <w10:wrap anchorx="page" anchory="margin"/>
+                  </v:shape>
+                </w:pict>
+              </mc:Fallback>
+            </mc:AlternateContent>
+          </w:r>
+          <w:r>
+            <w:rPr>
+              <w:b/>
+              <w:color w:val="1F4588"/>
+              <w:sz w:val="44"/>
+            </w:rPr>
+            <w:br w:type="page"/>
+          </w:r>
+        </w:p>
+      </w:sdtContent>
+    </w:sdt>
     <w:p>
       <w:pPr>
-        <w:jc w:val="center"/>
-      </w:pPr>
-      <w:r>
-        <w:rPr>
-          <w:sz w:val="24"/>
-        </w:rPr>
-        <w:t>Course: Internet of Things</w:t>
-      </w:r>
-      <w:r>
-        <w:rPr>
-          <w:sz w:val="24"/>
-        </w:rPr>
-        <w:br/>
-        <w:t>Program: Master of IT</w:t>
-      </w:r>
-      <w:r>
-        <w:rPr>
-          <w:sz w:val="24"/>
-        </w:rPr>
-        <w:br/>
-        <w:t>University: Sana'a University</w:t>
-      </w:r>
-      <w:r>
-        <w:rPr>
-          <w:sz w:val="24"/>
-        </w:rPr>
-        <w:br/>
-        <w:t>Supervisor: Dr. Ammar Zahary</w:t>
-      </w:r>
-      <w:r>
-        <w:rPr>
-          <w:sz w:val="24"/>
-        </w:rPr>
-        <w:br/>
-      </w:r>
-      <w:r>
-        <w:rPr>
-          <w:sz w:val="24"/>
-        </w:rPr>
-        <w:br/>
-        <w:t>Team Members:</w:t>
-      </w:r>
-      <w:r>
-        <w:rPr>
-          <w:sz w:val="24"/>
-        </w:rPr>
-        <w:br/>
-        <w:t>1. Osama Haider</w:t>
-      </w:r>
-      <w:r>
-        <w:rPr>
-          <w:sz w:val="24"/>
-        </w:rPr>
-        <w:br/>
-        <w:t>2. Saba Al-wesabi</w:t>
-      </w:r>
-      <w:r>
-        <w:rPr>
-          <w:sz w:val="24"/>
-        </w:rPr>
-        <w:br/>
-      </w:r>
-      <w:r>
-        <w:rPr>
-          <w:sz w:val="24"/>
-        </w:rPr>
-        <w:br/>
-        <w:t>Date: July 2026</w:t>
-      </w:r>
-    </w:p>
-    <w:p>
-      <w:r>
-        <w:br w:type="page"/>
-      </w:r>
-    </w:p>
-    <w:p>
-      <w:pPr>
         <w:pStyle w:val="Heading1"/>
       </w:pPr>
       <w:r>
-        <w:rPr>
-          <w:color w:val="1F4588"/>
-        </w:rPr>
         <w:lastRenderedPageBreak/>
         <w:t>Abstract</w:t>
       </w:r>
@@ -249,6 +1401,7 @@
           </w:tcPr>
           <w:p>
             <w:r>
+              <w:lastRenderedPageBreak/>
               <w:t>Device ID</w:t>
             </w:r>
           </w:p>
@@ -825,11 +1978,7 @@
     </w:p>
     <w:p>
       <w:r>
-        <w:t xml:space="preserve">The perception layer is based on IEEE 802.15.4 features on the physical and MAC layers represented in a simulation with a similar network profile to Zigbee. In contrast to other </w:t>
-      </w:r>
-      <w:r>
-        <w:lastRenderedPageBreak/>
-        <w:t>high-throughput LAN systems (Wi-Fi based on IEEE 802.11 standards) or wide-area outdoor approaches (</w:t>
+        <w:t>The perception layer is based on IEEE 802.15.4 features on the physical and MAC layers represented in a simulation with a similar network profile to Zigbee. In contrast to other high-throughput LAN systems (Wi-Fi based on IEEE 802.11 standards) or wide-area outdoor approaches (</w:t>
       </w:r>
       <w:proofErr w:type="spellStart"/>
       <w:r>
@@ -842,6 +1991,7 @@
     </w:p>
     <w:p>
       <w:r>
+        <w:lastRenderedPageBreak/>
         <w:t xml:space="preserve">In contrast to high-bandwidth technologies such as Wi-Fi that would drain the batteries rapidly, the sensors installed in the room need only to transmit telemetry information without requiring a high bandwidth connection. </w:t>
       </w:r>
       <w:proofErr w:type="spellStart"/>
@@ -1292,7 +2442,6 @@
     </w:p>
     <w:p>
       <w:r>
-        <w:lastRenderedPageBreak/>
         <w:t>Topic hierarchy:</w:t>
       </w:r>
     </w:p>
@@ -1300,6 +2449,10 @@
       <w:pPr>
         <w:pStyle w:val="NoSpacing"/>
         <w:shd w:val="clear" w:color="auto" w:fill="F2F2F2"/>
+        <w:rPr>
+          <w:rFonts w:hint="cs"/>
+          <w:rtl/>
+        </w:rPr>
       </w:pPr>
       <w:r>
         <w:rPr>
@@ -1327,6 +2480,7 @@
           <w:color w:val="202020"/>
           <w:sz w:val="18"/>
         </w:rPr>
+        <w:lastRenderedPageBreak/>
         <w:t>campus/floor_1/hall_1_1/hall_1_1/telemetry</w:t>
       </w:r>
     </w:p>
@@ -1700,6 +2854,7 @@
           </w:tcPr>
           <w:p>
             <w:r>
+              <w:lastRenderedPageBreak/>
               <w:t>high_temp_flag</w:t>
             </w:r>
           </w:p>
@@ -1938,6 +3093,105 @@
     </w:tbl>
     <w:p/>
     <w:p>
+      <w:r>
+        <w:t>Excel Persistent Data Storage (</w:t>
+      </w:r>
+      <w:proofErr w:type="spellStart"/>
+      <w:r>
+        <w:t>openpyxl</w:t>
+      </w:r>
+      <w:proofErr w:type="spellEnd"/>
+      <w:r>
+        <w:t xml:space="preserve"> Integration)</w:t>
+      </w:r>
+    </w:p>
+    <w:p>
+      <w:r>
+        <w:t xml:space="preserve">To ensure long-term data persistence without requiring heavy database installations, the subscriber engine uses </w:t>
+      </w:r>
+      <w:proofErr w:type="spellStart"/>
+      <w:r>
+        <w:t>openpyxl</w:t>
+      </w:r>
+      <w:proofErr w:type="spellEnd"/>
+      <w:r>
+        <w:t xml:space="preserve"> to automatically create and append telemetry records into data/campus_telemetry.xlsx.</w:t>
+      </w:r>
+    </w:p>
+    <w:p>
+      <w:pPr>
+        <w:pStyle w:val="ListParagraph"/>
+        <w:numPr>
+          <w:ilvl w:val="0"/>
+          <w:numId w:val="19"/>
+        </w:numPr>
+      </w:pPr>
+      <w:r>
+        <w:t>Automatic Initialization: If the file does not exist, _</w:t>
+      </w:r>
+      <w:proofErr w:type="spellStart"/>
+      <w:r>
+        <w:t>init_</w:t>
+      </w:r>
+      <w:proofErr w:type="gramStart"/>
+      <w:r>
+        <w:t>excel</w:t>
+      </w:r>
+      <w:proofErr w:type="spellEnd"/>
+      <w:r>
+        <w:t>(</w:t>
+      </w:r>
+      <w:proofErr w:type="gramEnd"/>
+      <w:r>
+        <w:t>) creates it with dark blue styled headers.</w:t>
+      </w:r>
+    </w:p>
+    <w:p>
+      <w:pPr>
+        <w:pStyle w:val="ListParagraph"/>
+        <w:numPr>
+          <w:ilvl w:val="0"/>
+          <w:numId w:val="19"/>
+        </w:numPr>
+      </w:pPr>
+      <w:r>
+        <w:t>17-Column Schema: Every valid telemetry payload appends a complete row containing timestamp, device metadata, raw sensor metrics, derived comfort/air quality indices, and triggered alerts.</w:t>
+      </w:r>
+    </w:p>
+    <w:p>
+      <w:pPr>
+        <w:pStyle w:val="ListParagraph"/>
+        <w:numPr>
+          <w:ilvl w:val="0"/>
+          <w:numId w:val="19"/>
+        </w:numPr>
+      </w:pPr>
+      <w:r>
+        <w:t xml:space="preserve">Windows Concurrency &amp; Lock Retry: On Windows, opening an Excel file creates a system lock. The </w:t>
+      </w:r>
+      <w:proofErr w:type="spellStart"/>
+      <w:r>
+        <w:t>save_to_</w:t>
+      </w:r>
+      <w:proofErr w:type="gramStart"/>
+      <w:r>
+        <w:t>excel</w:t>
+      </w:r>
+      <w:proofErr w:type="spellEnd"/>
+      <w:r>
+        <w:t>(</w:t>
+      </w:r>
+      <w:proofErr w:type="gramEnd"/>
+      <w:r>
+        <w:t>) function implements a 3-attempt retry logic with a 0.5s pause to prevent data loss when the file is open.</w:t>
+      </w:r>
+    </w:p>
+    <w:p>
+      <w:pPr>
+        <w:pStyle w:val="ListParagraph"/>
+      </w:pPr>
+    </w:p>
+    <w:p>
       <w:pPr>
         <w:pStyle w:val="Heading1"/>
       </w:pPr>
@@ -2062,7 +3316,6 @@
         <w:rPr>
           <w:color w:val="2E74B5"/>
         </w:rPr>
-        <w:lastRenderedPageBreak/>
         <w:t>Dashboard Visualization</w:t>
       </w:r>
     </w:p>
@@ -2122,7 +3375,6 @@
         <w:t>Figure 1: Smart Campus Node-RED Dashboard Live Telemetry</w:t>
       </w:r>
     </w:p>
-    <w:p/>
     <w:p>
       <w:pPr>
         <w:pStyle w:val="Heading1"/>
@@ -2313,7 +3565,6 @@
         <w:t xml:space="preserve"> callbacks) to detect any network failure and notify immediately through logging the broker offline event.</w:t>
       </w:r>
     </w:p>
-    <w:p/>
     <w:p>
       <w:pPr>
         <w:pStyle w:val="Heading1"/>
@@ -2607,7 +3858,6 @@
         </w:tc>
       </w:tr>
     </w:tbl>
-    <w:p/>
     <w:p>
       <w:pPr>
         <w:pStyle w:val="Heading2"/>
@@ -2616,7 +3866,6 @@
         <w:rPr>
           <w:color w:val="2E74B5"/>
         </w:rPr>
-        <w:lastRenderedPageBreak/>
         <w:t>Execution and Test Outputs</w:t>
       </w:r>
     </w:p>
@@ -2633,6 +3882,7 @@
         <w:rPr>
           <w:noProof/>
         </w:rPr>
+        <w:lastRenderedPageBreak/>
         <w:drawing>
           <wp:inline distT="0" distB="0" distL="0" distR="0" wp14:anchorId="34F09604" wp14:editId="0CB7D7E5">
             <wp:extent cx="5029200" cy="2967540"/>
@@ -2740,8 +3990,79 @@
         <w:rPr>
           <w:i/>
         </w:rPr>
+        <w:t>Figure 3: Python MQTT Subscriber &amp; Alerts Console</w:t>
+      </w:r>
+    </w:p>
+    <w:p>
+      <w:r>
+        <w:rPr>
+          <w:noProof/>
+        </w:rPr>
         <w:lastRenderedPageBreak/>
-        <w:t>Figure 3: Python MQTT Subscriber &amp; Alerts Console</w:t>
+        <w:drawing>
+          <wp:inline distT="0" distB="0" distL="0" distR="0" wp14:anchorId="0C10DAEC" wp14:editId="4F788BE2">
+            <wp:extent cx="5577840" cy="3267710"/>
+            <wp:effectExtent l="0" t="0" r="3810" b="8890"/>
+            <wp:docPr id="430402697" name="Picture 1"/>
+            <wp:cNvGraphicFramePr>
+              <a:graphicFrameLocks xmlns:a="http://schemas.openxmlformats.org/drawingml/2006/main" noChangeAspect="1"/>
+            </wp:cNvGraphicFramePr>
+            <a:graphic xmlns:a="http://schemas.openxmlformats.org/drawingml/2006/main">
+              <a:graphicData uri="http://schemas.openxmlformats.org/drawingml/2006/picture">
+                <pic:pic xmlns:pic="http://schemas.openxmlformats.org/drawingml/2006/picture">
+                  <pic:nvPicPr>
+                    <pic:cNvPr id="430402697" name=""/>
+                    <pic:cNvPicPr/>
+                  </pic:nvPicPr>
+                  <pic:blipFill>
+                    <a:blip r:embed="rId12"/>
+                    <a:stretch>
+                      <a:fillRect/>
+                    </a:stretch>
+                  </pic:blipFill>
+                  <pic:spPr>
+                    <a:xfrm>
+                      <a:off x="0" y="0"/>
+                      <a:ext cx="5577840" cy="3267710"/>
+                    </a:xfrm>
+                    <a:prstGeom prst="rect">
+                      <a:avLst/>
+                    </a:prstGeom>
+                  </pic:spPr>
+                </pic:pic>
+              </a:graphicData>
+            </a:graphic>
+          </wp:inline>
+        </w:drawing>
+      </w:r>
+    </w:p>
+    <w:p>
+      <w:pPr>
+        <w:jc w:val="center"/>
+      </w:pPr>
+      <w:r>
+        <w:rPr>
+          <w:i/>
+        </w:rPr>
+        <w:t xml:space="preserve">Figure </w:t>
+      </w:r>
+      <w:r>
+        <w:rPr>
+          <w:i/>
+        </w:rPr>
+        <w:t>4</w:t>
+      </w:r>
+      <w:r>
+        <w:rPr>
+          <w:i/>
+        </w:rPr>
+        <w:t xml:space="preserve">: </w:t>
+      </w:r>
+      <w:r>
+        <w:rPr>
+          <w:i/>
+        </w:rPr>
+        <w:t>Excel Persistent Data Storage</w:t>
       </w:r>
     </w:p>
     <w:p/>
@@ -2845,6 +4166,7 @@
         </w:numPr>
       </w:pPr>
       <w:r>
+        <w:lastRenderedPageBreak/>
         <w:t>Design a custom web dashboard with real-time visualizations.</w:t>
       </w:r>
     </w:p>
@@ -2904,7 +4226,13 @@
         <w:pStyle w:val="Heading1"/>
       </w:pPr>
       <w:r>
-        <w:t>12. Reflection</w:t>
+        <w:t>1</w:t>
+      </w:r>
+      <w:r>
+        <w:t>1</w:t>
+      </w:r>
+      <w:r>
+        <w:t>. Reflection</w:t>
       </w:r>
     </w:p>
     <w:p>
@@ -2943,11 +4271,7 @@
       </w:r>
       <w:proofErr w:type="gramEnd"/>
       <w:r>
-        <w:t xml:space="preserve"> publish/subscribe model, which is quite different from the typical request-response HTTP communication. I also learnt how to create a structured topic </w:t>
-      </w:r>
-      <w:r>
-        <w:lastRenderedPageBreak/>
-        <w:t>hierarchy to organize device data in a logical and scalable manner. Understanding the way in which JSON payloads are validated and processed at the edge layer was an eye-opener for me regarding the importance of data quality in IoT systems.</w:t>
+        <w:t xml:space="preserve"> publish/subscribe model, which is quite different from the typical request-response HTTP communication. I also learnt how to create a structured topic hierarchy to organize device data in a logical and scalable manner. Understanding the way in which JSON payloads are validated and processed at the edge layer was an eye-opener for me regarding the importance of data quality in IoT systems.</w:t>
       </w:r>
     </w:p>
     <w:p>
@@ -3001,6 +4325,370 @@
     </w:p>
     <w:p>
       <w:pPr>
+        <w:pStyle w:val="Heading1"/>
+      </w:pPr>
+      <w:r>
+        <w:t>1</w:t>
+      </w:r>
+      <w:r>
+        <w:t>2</w:t>
+      </w:r>
+      <w:r>
+        <w:t>. AI Usage Disclosure and Student Reflection</w:t>
+      </w:r>
+    </w:p>
+    <w:p>
+      <w:pPr>
+        <w:keepNext/>
+        <w:spacing w:before="240" w:after="80"/>
+        <w:rPr>
+          <w:b/>
+          <w:bCs/>
+        </w:rPr>
+      </w:pPr>
+      <w:r>
+        <w:rPr>
+          <w:b/>
+          <w:bCs/>
+        </w:rPr>
+        <w:t>Academic AI Disclosure</w:t>
+      </w:r>
+    </w:p>
+    <w:p>
+      <w:pPr>
+        <w:spacing w:after="120"/>
+      </w:pPr>
+      <w:r>
+        <w:t>We</w:t>
+      </w:r>
+      <w:r>
+        <w:t xml:space="preserve"> transparently disclose the use of AI assistance (Antigravity AI, powered by Google DeepMind) during the development of this project.</w:t>
+      </w:r>
+    </w:p>
+    <w:tbl>
+      <w:tblPr>
+        <w:tblW w:w="0" w:type="auto"/>
+        <w:jc w:val="center"/>
+        <w:tblLook w:val="04A0" w:firstRow="1" w:lastRow="0" w:firstColumn="1" w:lastColumn="0" w:noHBand="0" w:noVBand="1"/>
+      </w:tblPr>
+      <w:tblGrid>
+        <w:gridCol w:w="3131"/>
+        <w:gridCol w:w="2950"/>
+        <w:gridCol w:w="2919"/>
+      </w:tblGrid>
+      <w:tr>
+        <w:trPr>
+          <w:jc w:val="center"/>
+        </w:trPr>
+        <w:tc>
+          <w:tcPr>
+            <w:tcW w:w="3120" w:type="dxa"/>
+            <w:shd w:val="clear" w:color="auto" w:fill="1F4E79"/>
+          </w:tcPr>
+          <w:p>
+            <w:r>
+              <w:rPr>
+                <w:b/>
+                <w:color w:val="FFFFFF"/>
+              </w:rPr>
+              <w:t>Project Component</w:t>
+            </w:r>
+          </w:p>
+        </w:tc>
+        <w:tc>
+          <w:tcPr>
+            <w:tcW w:w="3120" w:type="dxa"/>
+            <w:shd w:val="clear" w:color="auto" w:fill="1F4E79"/>
+          </w:tcPr>
+          <w:p>
+            <w:r>
+              <w:rPr>
+                <w:b/>
+                <w:color w:val="FFFFFF"/>
+              </w:rPr>
+              <w:t>AI Contribution Role</w:t>
+            </w:r>
+          </w:p>
+        </w:tc>
+        <w:tc>
+          <w:tcPr>
+            <w:tcW w:w="3120" w:type="dxa"/>
+            <w:shd w:val="clear" w:color="auto" w:fill="1F4E79"/>
+          </w:tcPr>
+          <w:p>
+            <w:r>
+              <w:rPr>
+                <w:b/>
+                <w:color w:val="FFFFFF"/>
+              </w:rPr>
+              <w:t>Estimated AI %</w:t>
+            </w:r>
+          </w:p>
+        </w:tc>
+      </w:tr>
+      <w:tr>
+        <w:trPr>
+          <w:jc w:val="center"/>
+        </w:trPr>
+        <w:tc>
+          <w:tcPr>
+            <w:tcW w:w="3120" w:type="dxa"/>
+          </w:tcPr>
+          <w:p>
+            <w:r>
+              <w:t>simulator/device_simulator.py</w:t>
+            </w:r>
+          </w:p>
+        </w:tc>
+        <w:tc>
+          <w:tcPr>
+            <w:tcW w:w="3120" w:type="dxa"/>
+          </w:tcPr>
+          <w:p>
+            <w:r>
+              <w:t xml:space="preserve">Code generation of </w:t>
+            </w:r>
+            <w:proofErr w:type="spellStart"/>
+            <w:r>
+              <w:t>VirtualDevice</w:t>
+            </w:r>
+            <w:proofErr w:type="spellEnd"/>
+            <w:r>
+              <w:t xml:space="preserve"> class &amp; Zigbee </w:t>
+            </w:r>
+            <w:r>
+              <w:lastRenderedPageBreak/>
+              <w:t>model</w:t>
+            </w:r>
+          </w:p>
+        </w:tc>
+        <w:tc>
+          <w:tcPr>
+            <w:tcW w:w="3120" w:type="dxa"/>
+          </w:tcPr>
+          <w:p>
+            <w:r>
+              <w:lastRenderedPageBreak/>
+              <w:t>~</w:t>
+            </w:r>
+            <w:r>
+              <w:t>7</w:t>
+            </w:r>
+            <w:r>
+              <w:t xml:space="preserve">5% AI / </w:t>
+            </w:r>
+            <w:r>
+              <w:t>2</w:t>
+            </w:r>
+            <w:r>
+              <w:t>5% Student</w:t>
+            </w:r>
+          </w:p>
+        </w:tc>
+      </w:tr>
+      <w:tr>
+        <w:trPr>
+          <w:jc w:val="center"/>
+        </w:trPr>
+        <w:tc>
+          <w:tcPr>
+            <w:tcW w:w="3120" w:type="dxa"/>
+            <w:shd w:val="clear" w:color="auto" w:fill="F2F2F2"/>
+          </w:tcPr>
+          <w:p>
+            <w:r>
+              <w:t>processing/subscriber.py</w:t>
+            </w:r>
+          </w:p>
+        </w:tc>
+        <w:tc>
+          <w:tcPr>
+            <w:tcW w:w="3120" w:type="dxa"/>
+            <w:shd w:val="clear" w:color="auto" w:fill="F2F2F2"/>
+          </w:tcPr>
+          <w:p>
+            <w:r>
+              <w:t xml:space="preserve">Validation rules, </w:t>
+            </w:r>
+            <w:proofErr w:type="spellStart"/>
+            <w:r>
+              <w:t>openpyxl</w:t>
+            </w:r>
+            <w:proofErr w:type="spellEnd"/>
+            <w:r>
+              <w:t xml:space="preserve"> logic, alert handling</w:t>
+            </w:r>
+          </w:p>
+        </w:tc>
+        <w:tc>
+          <w:tcPr>
+            <w:tcW w:w="3120" w:type="dxa"/>
+            <w:shd w:val="clear" w:color="auto" w:fill="F2F2F2"/>
+          </w:tcPr>
+          <w:p>
+            <w:r>
+              <w:t>~</w:t>
+            </w:r>
+            <w:r>
+              <w:t>8</w:t>
+            </w:r>
+            <w:r>
+              <w:t xml:space="preserve">0% AI / </w:t>
+            </w:r>
+            <w:r>
+              <w:t>2</w:t>
+            </w:r>
+            <w:r>
+              <w:t>0% Student</w:t>
+            </w:r>
+          </w:p>
+        </w:tc>
+      </w:tr>
+      <w:tr>
+        <w:trPr>
+          <w:jc w:val="center"/>
+        </w:trPr>
+        <w:tc>
+          <w:tcPr>
+            <w:tcW w:w="3120" w:type="dxa"/>
+          </w:tcPr>
+          <w:p>
+            <w:r>
+              <w:t>simulator/</w:t>
+            </w:r>
+            <w:proofErr w:type="spellStart"/>
+            <w:r>
+              <w:t>config.json</w:t>
+            </w:r>
+            <w:proofErr w:type="spellEnd"/>
+          </w:p>
+        </w:tc>
+        <w:tc>
+          <w:tcPr>
+            <w:tcW w:w="3120" w:type="dxa"/>
+          </w:tcPr>
+          <w:p>
+            <w:r>
+              <w:t>JSON schema design and sensor range configuration</w:t>
+            </w:r>
+          </w:p>
+        </w:tc>
+        <w:tc>
+          <w:tcPr>
+            <w:tcW w:w="3120" w:type="dxa"/>
+          </w:tcPr>
+          <w:p>
+            <w:r>
+              <w:t>~</w:t>
+            </w:r>
+            <w:r>
+              <w:t>7</w:t>
+            </w:r>
+            <w:r>
+              <w:t xml:space="preserve">0% AI / </w:t>
+            </w:r>
+            <w:r>
+              <w:t>3</w:t>
+            </w:r>
+            <w:r>
+              <w:t>0% Student</w:t>
+            </w:r>
+          </w:p>
+        </w:tc>
+      </w:tr>
+      <w:tr>
+        <w:trPr>
+          <w:jc w:val="center"/>
+        </w:trPr>
+        <w:tc>
+          <w:tcPr>
+            <w:tcW w:w="3120" w:type="dxa"/>
+            <w:shd w:val="clear" w:color="auto" w:fill="F2F2F2"/>
+          </w:tcPr>
+          <w:p>
+            <w:r>
+              <w:t>dashboard/</w:t>
+            </w:r>
+            <w:proofErr w:type="spellStart"/>
+            <w:r>
+              <w:t>node_red_flow.json</w:t>
+            </w:r>
+            <w:proofErr w:type="spellEnd"/>
+          </w:p>
+        </w:tc>
+        <w:tc>
+          <w:tcPr>
+            <w:tcW w:w="3120" w:type="dxa"/>
+            <w:shd w:val="clear" w:color="auto" w:fill="F2F2F2"/>
+          </w:tcPr>
+          <w:p>
+            <w:r>
+              <w:t>Node-RED flow setup and dashboard layout</w:t>
+            </w:r>
+          </w:p>
+        </w:tc>
+        <w:tc>
+          <w:tcPr>
+            <w:tcW w:w="3120" w:type="dxa"/>
+            <w:shd w:val="clear" w:color="auto" w:fill="F2F2F2"/>
+          </w:tcPr>
+          <w:p>
+            <w:r>
+              <w:t>~</w:t>
+            </w:r>
+            <w:r>
+              <w:t>2</w:t>
+            </w:r>
+            <w:r>
+              <w:t xml:space="preserve">0% AI / </w:t>
+            </w:r>
+            <w:r>
+              <w:t>8</w:t>
+            </w:r>
+            <w:r>
+              <w:t>0% Student</w:t>
+            </w:r>
+          </w:p>
+        </w:tc>
+      </w:tr>
+      <w:tr>
+        <w:trPr>
+          <w:jc w:val="center"/>
+        </w:trPr>
+        <w:tc>
+          <w:tcPr>
+            <w:tcW w:w="3120" w:type="dxa"/>
+          </w:tcPr>
+          <w:p>
+            <w:r>
+              <w:t>Testing, Running, &amp; Verification</w:t>
+            </w:r>
+          </w:p>
+        </w:tc>
+        <w:tc>
+          <w:tcPr>
+            <w:tcW w:w="3120" w:type="dxa"/>
+          </w:tcPr>
+          <w:p>
+            <w:r>
+              <w:t>Executing code, Node-RED deployment, manual tests</w:t>
+            </w:r>
+          </w:p>
+        </w:tc>
+        <w:tc>
+          <w:tcPr>
+            <w:tcW w:w="3120" w:type="dxa"/>
+          </w:tcPr>
+          <w:p>
+            <w:r>
+              <w:t xml:space="preserve">0% AI / 100% Student </w:t>
+            </w:r>
+          </w:p>
+        </w:tc>
+      </w:tr>
+    </w:tbl>
+    <w:p>
+      <w:pPr>
         <w:rPr>
           <w:rtl/>
         </w:rPr>
@@ -3014,7 +4702,19 @@
         <w:rPr>
           <w:color w:val="1F4588"/>
         </w:rPr>
-        <w:t>11. References</w:t>
+        <w:t>1</w:t>
+      </w:r>
+      <w:r>
+        <w:rPr>
+          <w:color w:val="1F4588"/>
+        </w:rPr>
+        <w:t>3</w:t>
+      </w:r>
+      <w:r>
+        <w:rPr>
+          <w:color w:val="1F4588"/>
+        </w:rPr>
+        <w:t>. References</w:t>
       </w:r>
     </w:p>
     <w:p>
@@ -3069,7 +4769,7 @@
       <w:r>
         <w:t xml:space="preserve">Connectivity Standards Alliance Zigbee. </w:t>
       </w:r>
-      <w:hyperlink r:id="rId12" w:history="1">
+      <w:hyperlink r:id="rId13" w:history="1">
         <w:r>
           <w:rPr>
             <w:rStyle w:val="Hyperlink"/>
@@ -3082,8 +4782,10 @@
     <w:p/>
     <w:sectPr>
       <w:pgSz w:w="12240" w:h="15840"/>
-      <w:pgMar w:top="1440" w:right="1728" w:bottom="1440" w:left="1728" w:header="720" w:footer="720" w:gutter="0"/>
+      <w:pgMar w:top="993" w:right="1728" w:bottom="1440" w:left="1728" w:header="720" w:footer="720" w:gutter="0"/>
+      <w:pgNumType w:start="0"/>
       <w:cols w:space="720"/>
+      <w:titlePg/>
       <w:docGrid w:linePitch="360"/>
     </w:sectPr>
   </w:body>
@@ -3877,6 +5579,119 @@
     </w:lvl>
   </w:abstractNum>
   <w:abstractNum w:abstractNumId="14" w15:restartNumberingAfterBreak="0">
+    <w:nsid w:val="3E8129B4"/>
+    <w:multiLevelType w:val="hybridMultilevel"/>
+    <w:tmpl w:val="1D383012"/>
+    <w:lvl w:ilvl="0" w:tplc="04090001">
+      <w:start w:val="1"/>
+      <w:numFmt w:val="bullet"/>
+      <w:lvlText w:val=""/>
+      <w:lvlJc w:val="left"/>
+      <w:pPr>
+        <w:ind w:left="720" w:hanging="360"/>
+      </w:pPr>
+      <w:rPr>
+        <w:rFonts w:ascii="Symbol" w:hAnsi="Symbol" w:hint="default"/>
+      </w:rPr>
+    </w:lvl>
+    <w:lvl w:ilvl="1" w:tplc="04090003" w:tentative="1">
+      <w:start w:val="1"/>
+      <w:numFmt w:val="bullet"/>
+      <w:lvlText w:val="o"/>
+      <w:lvlJc w:val="left"/>
+      <w:pPr>
+        <w:ind w:left="1440" w:hanging="360"/>
+      </w:pPr>
+      <w:rPr>
+        <w:rFonts w:ascii="Courier New" w:hAnsi="Courier New" w:cs="Courier New" w:hint="default"/>
+      </w:rPr>
+    </w:lvl>
+    <w:lvl w:ilvl="2" w:tplc="04090005" w:tentative="1">
+      <w:start w:val="1"/>
+      <w:numFmt w:val="bullet"/>
+      <w:lvlText w:val=""/>
+      <w:lvlJc w:val="left"/>
+      <w:pPr>
+        <w:ind w:left="2160" w:hanging="360"/>
+      </w:pPr>
+      <w:rPr>
+        <w:rFonts w:ascii="Wingdings" w:hAnsi="Wingdings" w:hint="default"/>
+      </w:rPr>
+    </w:lvl>
+    <w:lvl w:ilvl="3" w:tplc="04090001" w:tentative="1">
+      <w:start w:val="1"/>
+      <w:numFmt w:val="bullet"/>
+      <w:lvlText w:val=""/>
+      <w:lvlJc w:val="left"/>
+      <w:pPr>
+        <w:ind w:left="2880" w:hanging="360"/>
+      </w:pPr>
+      <w:rPr>
+        <w:rFonts w:ascii="Symbol" w:hAnsi="Symbol" w:hint="default"/>
+      </w:rPr>
+    </w:lvl>
+    <w:lvl w:ilvl="4" w:tplc="04090003" w:tentative="1">
+      <w:start w:val="1"/>
+      <w:numFmt w:val="bullet"/>
+      <w:lvlText w:val="o"/>
+      <w:lvlJc w:val="left"/>
+      <w:pPr>
+        <w:ind w:left="3600" w:hanging="360"/>
+      </w:pPr>
+      <w:rPr>
+        <w:rFonts w:ascii="Courier New" w:hAnsi="Courier New" w:cs="Courier New" w:hint="default"/>
+      </w:rPr>
+    </w:lvl>
+    <w:lvl w:ilvl="5" w:tplc="04090005" w:tentative="1">
+      <w:start w:val="1"/>
+      <w:numFmt w:val="bullet"/>
+      <w:lvlText w:val=""/>
+      <w:lvlJc w:val="left"/>
+      <w:pPr>
+        <w:ind w:left="4320" w:hanging="360"/>
+      </w:pPr>
+      <w:rPr>
+        <w:rFonts w:ascii="Wingdings" w:hAnsi="Wingdings" w:hint="default"/>
+      </w:rPr>
+    </w:lvl>
+    <w:lvl w:ilvl="6" w:tplc="04090001" w:tentative="1">
+      <w:start w:val="1"/>
+      <w:numFmt w:val="bullet"/>
+      <w:lvlText w:val=""/>
+      <w:lvlJc w:val="left"/>
+      <w:pPr>
+        <w:ind w:left="5040" w:hanging="360"/>
+      </w:pPr>
+      <w:rPr>
+        <w:rFonts w:ascii="Symbol" w:hAnsi="Symbol" w:hint="default"/>
+      </w:rPr>
+    </w:lvl>
+    <w:lvl w:ilvl="7" w:tplc="04090003" w:tentative="1">
+      <w:start w:val="1"/>
+      <w:numFmt w:val="bullet"/>
+      <w:lvlText w:val="o"/>
+      <w:lvlJc w:val="left"/>
+      <w:pPr>
+        <w:ind w:left="5760" w:hanging="360"/>
+      </w:pPr>
+      <w:rPr>
+        <w:rFonts w:ascii="Courier New" w:hAnsi="Courier New" w:cs="Courier New" w:hint="default"/>
+      </w:rPr>
+    </w:lvl>
+    <w:lvl w:ilvl="8" w:tplc="04090005" w:tentative="1">
+      <w:start w:val="1"/>
+      <w:numFmt w:val="bullet"/>
+      <w:lvlText w:val=""/>
+      <w:lvlJc w:val="left"/>
+      <w:pPr>
+        <w:ind w:left="6480" w:hanging="360"/>
+      </w:pPr>
+      <w:rPr>
+        <w:rFonts w:ascii="Wingdings" w:hAnsi="Wingdings" w:hint="default"/>
+      </w:rPr>
+    </w:lvl>
+  </w:abstractNum>
+  <w:abstractNum w:abstractNumId="15" w15:restartNumberingAfterBreak="0">
     <w:nsid w:val="4FB76766"/>
     <w:multiLevelType w:val="hybridMultilevel"/>
     <w:tmpl w:val="EF1ED586"/>
@@ -3988,13 +5803,125 @@
       </w:rPr>
     </w:lvl>
   </w:abstractNum>
-  <w:abstractNum w:abstractNumId="15" w15:restartNumberingAfterBreak="0">
+  <w:abstractNum w:abstractNumId="16" w15:restartNumberingAfterBreak="0">
     <w:nsid w:val="5AAD60D5"/>
     <w:multiLevelType w:val="hybridMultilevel"/>
     <w:tmpl w:val="DA9C4D2A"/>
     <w:lvl w:ilvl="0" w:tplc="0908C194">
       <w:numFmt w:val="bullet"/>
       <w:lvlText w:val="•"/>
+      <w:lvlJc w:val="left"/>
+      <w:pPr>
+        <w:ind w:left="720" w:hanging="360"/>
+      </w:pPr>
+      <w:rPr>
+        <w:rFonts w:ascii="Cambria" w:eastAsiaTheme="minorEastAsia" w:hAnsi="Cambria" w:cstheme="minorBidi" w:hint="default"/>
+      </w:rPr>
+    </w:lvl>
+    <w:lvl w:ilvl="1" w:tplc="04090003" w:tentative="1">
+      <w:start w:val="1"/>
+      <w:numFmt w:val="bullet"/>
+      <w:lvlText w:val="o"/>
+      <w:lvlJc w:val="left"/>
+      <w:pPr>
+        <w:ind w:left="1440" w:hanging="360"/>
+      </w:pPr>
+      <w:rPr>
+        <w:rFonts w:ascii="Courier New" w:hAnsi="Courier New" w:cs="Courier New" w:hint="default"/>
+      </w:rPr>
+    </w:lvl>
+    <w:lvl w:ilvl="2" w:tplc="04090005" w:tentative="1">
+      <w:start w:val="1"/>
+      <w:numFmt w:val="bullet"/>
+      <w:lvlText w:val=""/>
+      <w:lvlJc w:val="left"/>
+      <w:pPr>
+        <w:ind w:left="2160" w:hanging="360"/>
+      </w:pPr>
+      <w:rPr>
+        <w:rFonts w:ascii="Wingdings" w:hAnsi="Wingdings" w:hint="default"/>
+      </w:rPr>
+    </w:lvl>
+    <w:lvl w:ilvl="3" w:tplc="04090001" w:tentative="1">
+      <w:start w:val="1"/>
+      <w:numFmt w:val="bullet"/>
+      <w:lvlText w:val=""/>
+      <w:lvlJc w:val="left"/>
+      <w:pPr>
+        <w:ind w:left="2880" w:hanging="360"/>
+      </w:pPr>
+      <w:rPr>
+        <w:rFonts w:ascii="Symbol" w:hAnsi="Symbol" w:hint="default"/>
+      </w:rPr>
+    </w:lvl>
+    <w:lvl w:ilvl="4" w:tplc="04090003" w:tentative="1">
+      <w:start w:val="1"/>
+      <w:numFmt w:val="bullet"/>
+      <w:lvlText w:val="o"/>
+      <w:lvlJc w:val="left"/>
+      <w:pPr>
+        <w:ind w:left="3600" w:hanging="360"/>
+      </w:pPr>
+      <w:rPr>
+        <w:rFonts w:ascii="Courier New" w:hAnsi="Courier New" w:cs="Courier New" w:hint="default"/>
+      </w:rPr>
+    </w:lvl>
+    <w:lvl w:ilvl="5" w:tplc="04090005" w:tentative="1">
+      <w:start w:val="1"/>
+      <w:numFmt w:val="bullet"/>
+      <w:lvlText w:val=""/>
+      <w:lvlJc w:val="left"/>
+      <w:pPr>
+        <w:ind w:left="4320" w:hanging="360"/>
+      </w:pPr>
+      <w:rPr>
+        <w:rFonts w:ascii="Wingdings" w:hAnsi="Wingdings" w:hint="default"/>
+      </w:rPr>
+    </w:lvl>
+    <w:lvl w:ilvl="6" w:tplc="04090001" w:tentative="1">
+      <w:start w:val="1"/>
+      <w:numFmt w:val="bullet"/>
+      <w:lvlText w:val=""/>
+      <w:lvlJc w:val="left"/>
+      <w:pPr>
+        <w:ind w:left="5040" w:hanging="360"/>
+      </w:pPr>
+      <w:rPr>
+        <w:rFonts w:ascii="Symbol" w:hAnsi="Symbol" w:hint="default"/>
+      </w:rPr>
+    </w:lvl>
+    <w:lvl w:ilvl="7" w:tplc="04090003" w:tentative="1">
+      <w:start w:val="1"/>
+      <w:numFmt w:val="bullet"/>
+      <w:lvlText w:val="o"/>
+      <w:lvlJc w:val="left"/>
+      <w:pPr>
+        <w:ind w:left="5760" w:hanging="360"/>
+      </w:pPr>
+      <w:rPr>
+        <w:rFonts w:ascii="Courier New" w:hAnsi="Courier New" w:cs="Courier New" w:hint="default"/>
+      </w:rPr>
+    </w:lvl>
+    <w:lvl w:ilvl="8" w:tplc="04090005" w:tentative="1">
+      <w:start w:val="1"/>
+      <w:numFmt w:val="bullet"/>
+      <w:lvlText w:val=""/>
+      <w:lvlJc w:val="left"/>
+      <w:pPr>
+        <w:ind w:left="6480" w:hanging="360"/>
+      </w:pPr>
+      <w:rPr>
+        <w:rFonts w:ascii="Wingdings" w:hAnsi="Wingdings" w:hint="default"/>
+      </w:rPr>
+    </w:lvl>
+  </w:abstractNum>
+  <w:abstractNum w:abstractNumId="17" w15:restartNumberingAfterBreak="0">
+    <w:nsid w:val="760E5638"/>
+    <w:multiLevelType w:val="hybridMultilevel"/>
+    <w:tmpl w:val="B52E2308"/>
+    <w:lvl w:ilvl="0" w:tplc="E1C24C40">
+      <w:numFmt w:val="bullet"/>
+      <w:lvlText w:val="-"/>
       <w:lvlJc w:val="left"/>
       <w:pPr>
         <w:ind w:left="720" w:hanging="360"/>
@@ -4131,7 +6058,7 @@
     <w:abstractNumId w:val="12"/>
   </w:num>
   <w:num w:numId="11" w16cid:durableId="466169905">
-    <w:abstractNumId w:val="15"/>
+    <w:abstractNumId w:val="16"/>
   </w:num>
   <w:num w:numId="12" w16cid:durableId="1669554910">
     <w:abstractNumId w:val="11"/>
@@ -4146,10 +6073,16 @@
     <w:abstractNumId w:val="10"/>
   </w:num>
   <w:num w:numId="16" w16cid:durableId="2056156376">
-    <w:abstractNumId w:val="14"/>
+    <w:abstractNumId w:val="15"/>
   </w:num>
   <w:num w:numId="17" w16cid:durableId="252208625">
     <w:abstractNumId w:val="7"/>
+  </w:num>
+  <w:num w:numId="18" w16cid:durableId="177693653">
+    <w:abstractNumId w:val="14"/>
+  </w:num>
+  <w:num w:numId="19" w16cid:durableId="631398876">
+    <w:abstractNumId w:val="17"/>
   </w:num>
 </w:numbering>
 </file>
@@ -4543,7 +6476,7 @@
   <w:style w:type="paragraph" w:default="1" w:styleId="Normal">
     <w:name w:val="Normal"/>
     <w:qFormat/>
-    <w:rsid w:val="00FC693F"/>
+    <w:rsid w:val="00C56292"/>
   </w:style>
   <w:style w:type="paragraph" w:styleId="Heading1">
     <w:name w:val="heading 1"/>
@@ -4826,6 +6759,7 @@
   </w:style>
   <w:style w:type="paragraph" w:styleId="NoSpacing">
     <w:name w:val="No Spacing"/>
+    <w:link w:val="NoSpacingChar"/>
     <w:uiPriority w:val="1"/>
     <w:qFormat/>
     <w:rsid w:val="00FC693F"/>
@@ -15569,6 +17503,13 @@
       <w:shd w:val="clear" w:color="auto" w:fill="E1DFDD"/>
     </w:rPr>
   </w:style>
+  <w:style w:type="character" w:customStyle="1" w:styleId="NoSpacingChar">
+    <w:name w:val="No Spacing Char"/>
+    <w:basedOn w:val="DefaultParagraphFont"/>
+    <w:link w:val="NoSpacing"/>
+    <w:uiPriority w:val="1"/>
+    <w:rsid w:val="00E31530"/>
+  </w:style>
 </w:styles>
 </file>
 

</xml_diff>